<commit_message>
Perubahan kolom pematerian dan untuk tanda tangan di Laporan agustus dan September 2025
</commit_message>
<xml_diff>
--- a/Laporan SKC Agustus 2025.docx
+++ b/Laporan SKC Agustus 2025.docx
@@ -94,8 +94,39 @@
           <w:szCs w:val="24"/>
         </w:rPr>
         <w:tab/>
-        <w:t>: Smancir Komputer Club</w:t>
+        <w:t xml:space="preserve">: </w:t>
       </w:r>
+      <w:proofErr w:type="spellStart"/>
+      <w:r>
+        <w:rPr>
+          <w:rFonts w:ascii="Times New Roman" w:eastAsia="Times New Roman" w:hAnsi="Times New Roman" w:cs="Times New Roman"/>
+          <w:b/>
+          <w:sz w:val="24"/>
+          <w:szCs w:val="24"/>
+        </w:rPr>
+        <w:t>Smancir</w:t>
+      </w:r>
+      <w:proofErr w:type="spellEnd"/>
+      <w:r>
+        <w:rPr>
+          <w:rFonts w:ascii="Times New Roman" w:eastAsia="Times New Roman" w:hAnsi="Times New Roman" w:cs="Times New Roman"/>
+          <w:b/>
+          <w:sz w:val="24"/>
+          <w:szCs w:val="24"/>
+        </w:rPr>
+        <w:t xml:space="preserve"> Komputer </w:t>
+      </w:r>
+      <w:proofErr w:type="spellStart"/>
+      <w:r>
+        <w:rPr>
+          <w:rFonts w:ascii="Times New Roman" w:eastAsia="Times New Roman" w:hAnsi="Times New Roman" w:cs="Times New Roman"/>
+          <w:b/>
+          <w:sz w:val="24"/>
+          <w:szCs w:val="24"/>
+        </w:rPr>
+        <w:t>Club</w:t>
+      </w:r>
+      <w:proofErr w:type="spellEnd"/>
     </w:p>
     <w:p>
       <w:pPr>
@@ -272,12 +303,12 @@
         <w:tblLook w:val="0400" w:firstRow="0" w:lastRow="0" w:firstColumn="0" w:lastColumn="0" w:noHBand="0" w:noVBand="1"/>
       </w:tblPr>
       <w:tblGrid>
-        <w:gridCol w:w="563"/>
-        <w:gridCol w:w="1276"/>
-        <w:gridCol w:w="1146"/>
-        <w:gridCol w:w="1774"/>
-        <w:gridCol w:w="2127"/>
-        <w:gridCol w:w="2130"/>
+        <w:gridCol w:w="570"/>
+        <w:gridCol w:w="1296"/>
+        <w:gridCol w:w="1317"/>
+        <w:gridCol w:w="1880"/>
+        <w:gridCol w:w="2163"/>
+        <w:gridCol w:w="1790"/>
       </w:tblGrid>
       <w:tr>
         <w:tc>
@@ -413,13 +444,23 @@
                 <w:szCs w:val="24"/>
               </w:rPr>
             </w:pPr>
-            <w:r>
-              <w:rPr>
-                <w:rFonts w:ascii="Times New Roman" w:eastAsia="Times New Roman" w:hAnsi="Times New Roman" w:cs="Times New Roman"/>
-                <w:sz w:val="24"/>
-                <w:szCs w:val="24"/>
-              </w:rPr>
-              <w:t>Ttd Pembina/Pelatih</w:t>
+            <w:proofErr w:type="spellStart"/>
+            <w:r>
+              <w:rPr>
+                <w:rFonts w:ascii="Times New Roman" w:eastAsia="Times New Roman" w:hAnsi="Times New Roman" w:cs="Times New Roman"/>
+                <w:sz w:val="24"/>
+                <w:szCs w:val="24"/>
+              </w:rPr>
+              <w:t>Ttd</w:t>
+            </w:r>
+            <w:proofErr w:type="spellEnd"/>
+            <w:r>
+              <w:rPr>
+                <w:rFonts w:ascii="Times New Roman" w:eastAsia="Times New Roman" w:hAnsi="Times New Roman" w:cs="Times New Roman"/>
+                <w:sz w:val="24"/>
+                <w:szCs w:val="24"/>
+              </w:rPr>
+              <w:t xml:space="preserve"> Pembina/Pelatih</w:t>
             </w:r>
           </w:p>
         </w:tc>
@@ -496,30 +537,77 @@
                 <w:sz w:val="24"/>
                 <w:szCs w:val="24"/>
               </w:rPr>
-              <w:t>SMAN 1 Ciranjang</w:t>
-            </w:r>
+              <w:t xml:space="preserve">SMAN 1 </w:t>
+            </w:r>
+            <w:proofErr w:type="spellStart"/>
+            <w:r>
+              <w:rPr>
+                <w:rFonts w:ascii="Times New Roman" w:eastAsia="Times New Roman" w:hAnsi="Times New Roman" w:cs="Times New Roman"/>
+                <w:sz w:val="24"/>
+                <w:szCs w:val="24"/>
+              </w:rPr>
+              <w:t>Ciranjang</w:t>
+            </w:r>
+            <w:proofErr w:type="spellEnd"/>
           </w:p>
         </w:tc>
         <w:tc>
           <w:tcPr>
             <w:tcW w:w="1235" w:type="pct"/>
-          </w:tcPr>
-          <w:p>
-            <w:pPr>
-              <w:jc w:val="center"/>
-              <w:rPr>
-                <w:rFonts w:ascii="Times New Roman" w:eastAsia="Times New Roman" w:hAnsi="Times New Roman" w:cs="Times New Roman"/>
-                <w:sz w:val="24"/>
-                <w:szCs w:val="24"/>
-              </w:rPr>
-            </w:pPr>
-            <w:r>
-              <w:rPr>
-                <w:rFonts w:ascii="Times New Roman" w:eastAsia="Times New Roman" w:hAnsi="Times New Roman" w:cs="Times New Roman"/>
-                <w:sz w:val="24"/>
-                <w:szCs w:val="24"/>
-              </w:rPr>
-              <w:t>Perkenalan dan Pengantar Mikrokontroler (Arduino, ESP32, &amp; STM32)</w:t>
+            <w:vAlign w:val="center"/>
+          </w:tcPr>
+          <w:p>
+            <w:pPr>
+              <w:jc w:val="center"/>
+              <w:rPr>
+                <w:rFonts w:ascii="Times New Roman" w:eastAsia="Times New Roman" w:hAnsi="Times New Roman" w:cs="Times New Roman"/>
+                <w:sz w:val="24"/>
+                <w:szCs w:val="24"/>
+              </w:rPr>
+            </w:pPr>
+            <w:r>
+              <w:rPr>
+                <w:rFonts w:ascii="Times New Roman" w:eastAsia="Times New Roman" w:hAnsi="Times New Roman" w:cs="Times New Roman"/>
+                <w:sz w:val="24"/>
+                <w:szCs w:val="24"/>
+              </w:rPr>
+              <w:t xml:space="preserve">Perkenalan dan Pengantar </w:t>
+            </w:r>
+            <w:proofErr w:type="spellStart"/>
+            <w:r>
+              <w:rPr>
+                <w:rFonts w:ascii="Times New Roman" w:eastAsia="Times New Roman" w:hAnsi="Times New Roman" w:cs="Times New Roman"/>
+                <w:sz w:val="24"/>
+                <w:szCs w:val="24"/>
+              </w:rPr>
+              <w:t>Mikrokontroler</w:t>
+            </w:r>
+            <w:proofErr w:type="spellEnd"/>
+            <w:r>
+              <w:rPr>
+                <w:rFonts w:ascii="Times New Roman" w:eastAsia="Times New Roman" w:hAnsi="Times New Roman" w:cs="Times New Roman"/>
+                <w:sz w:val="24"/>
+                <w:szCs w:val="24"/>
+              </w:rPr>
+              <w:t xml:space="preserve"> (</w:t>
+            </w:r>
+            <w:proofErr w:type="spellStart"/>
+            <w:r>
+              <w:rPr>
+                <w:rFonts w:ascii="Times New Roman" w:eastAsia="Times New Roman" w:hAnsi="Times New Roman" w:cs="Times New Roman"/>
+                <w:sz w:val="24"/>
+                <w:szCs w:val="24"/>
+              </w:rPr>
+              <w:t>Arduino</w:t>
+            </w:r>
+            <w:proofErr w:type="spellEnd"/>
+            <w:r>
+              <w:rPr>
+                <w:rFonts w:ascii="Times New Roman" w:eastAsia="Times New Roman" w:hAnsi="Times New Roman" w:cs="Times New Roman"/>
+                <w:sz w:val="24"/>
+                <w:szCs w:val="24"/>
+              </w:rPr>
+              <w:t>, ESP32, &amp; STM32)</w:t>
             </w:r>
           </w:p>
         </w:tc>
@@ -543,7 +631,43 @@
                 <w:sz w:val="24"/>
                 <w:szCs w:val="24"/>
               </w:rPr>
-              <w:t>Materi yang diajarkan mengenai pengenalan Mikrokontroler khususnya Arduino Uno dan penggunaannya dalam kehidupan sehari-hari. Materi disampaikan lewat Presentasi, Ceramah, Diskusi, dan Tanya jawab. Platform yang digunakan untuk belajar yaitu WOKWI Simulator</w:t>
+              <w:t xml:space="preserve">Materi yang diajarkan mengenai pengenalan </w:t>
+            </w:r>
+            <w:proofErr w:type="spellStart"/>
+            <w:r>
+              <w:rPr>
+                <w:rFonts w:ascii="Times New Roman" w:eastAsia="Times New Roman" w:hAnsi="Times New Roman" w:cs="Times New Roman"/>
+                <w:sz w:val="24"/>
+                <w:szCs w:val="24"/>
+              </w:rPr>
+              <w:t>Mikrokontroler</w:t>
+            </w:r>
+            <w:proofErr w:type="spellEnd"/>
+            <w:r>
+              <w:rPr>
+                <w:rFonts w:ascii="Times New Roman" w:eastAsia="Times New Roman" w:hAnsi="Times New Roman" w:cs="Times New Roman"/>
+                <w:sz w:val="24"/>
+                <w:szCs w:val="24"/>
+              </w:rPr>
+              <w:t xml:space="preserve"> khususnya </w:t>
+            </w:r>
+            <w:proofErr w:type="spellStart"/>
+            <w:r>
+              <w:rPr>
+                <w:rFonts w:ascii="Times New Roman" w:eastAsia="Times New Roman" w:hAnsi="Times New Roman" w:cs="Times New Roman"/>
+                <w:sz w:val="24"/>
+                <w:szCs w:val="24"/>
+              </w:rPr>
+              <w:t>Arduino</w:t>
+            </w:r>
+            <w:proofErr w:type="spellEnd"/>
+            <w:r>
+              <w:rPr>
+                <w:rFonts w:ascii="Times New Roman" w:eastAsia="Times New Roman" w:hAnsi="Times New Roman" w:cs="Times New Roman"/>
+                <w:sz w:val="24"/>
+                <w:szCs w:val="24"/>
+              </w:rPr>
+              <w:t xml:space="preserve"> Uno dan penggunaannya dalam kehidupan sehari-hari. Materi disampaikan lewat Presentasi, Ceramah, Diskusi, dan Tanya jawab. Platform yang digunakan untuk belajar yaitu WOKWI Simulator</w:t>
             </w:r>
           </w:p>
         </w:tc>
@@ -559,65 +683,6 @@
                 <w:szCs w:val="24"/>
               </w:rPr>
             </w:pPr>
-            <w:r>
-              <w:rPr>
-                <w:rFonts w:ascii="Times New Roman" w:eastAsia="Times New Roman" w:hAnsi="Times New Roman" w:cs="Times New Roman"/>
-                <w:noProof/>
-                <w:sz w:val="24"/>
-                <w:szCs w:val="24"/>
-              </w:rPr>
-              <w:drawing>
-                <wp:inline distT="0" distB="0" distL="0" distR="0" wp14:anchorId="167587CD" wp14:editId="4C01B16F">
-                  <wp:extent cx="1237207" cy="765544"/>
-                  <wp:effectExtent l="0" t="0" r="1270" b="0"/>
-                  <wp:docPr id="2014143181" name="Picture 1" descr="A signature on a white background&#10;&#10;AI-generated content may be incorrect."/>
-                  <wp:cNvGraphicFramePr>
-                    <a:graphicFrameLocks xmlns:a="http://schemas.openxmlformats.org/drawingml/2006/main" noChangeAspect="1"/>
-                  </wp:cNvGraphicFramePr>
-                  <a:graphic xmlns:a="http://schemas.openxmlformats.org/drawingml/2006/main">
-                    <a:graphicData uri="http://schemas.openxmlformats.org/drawingml/2006/picture">
-                      <pic:pic xmlns:pic="http://schemas.openxmlformats.org/drawingml/2006/picture">
-                        <pic:nvPicPr>
-                          <pic:cNvPr id="2014143181" name="Picture 1" descr="A signature on a white background&#10;&#10;AI-generated content may be incorrect."/>
-                          <pic:cNvPicPr/>
-                        </pic:nvPicPr>
-                        <pic:blipFill>
-                          <a:blip r:embed="rId6" cstate="print">
-                            <a:clrChange>
-                              <a:clrFrom>
-                                <a:srgbClr val="FFFFFF"/>
-                              </a:clrFrom>
-                              <a:clrTo>
-                                <a:srgbClr val="FFFFFF">
-                                  <a:alpha val="0"/>
-                                </a:srgbClr>
-                              </a:clrTo>
-                            </a:clrChange>
-                            <a:extLst>
-                              <a:ext uri="{28A0092B-C50C-407E-A947-70E740481C1C}">
-                                <a14:useLocalDpi xmlns:a14="http://schemas.microsoft.com/office/drawing/2010/main" val="0"/>
-                              </a:ext>
-                            </a:extLst>
-                          </a:blip>
-                          <a:stretch>
-                            <a:fillRect/>
-                          </a:stretch>
-                        </pic:blipFill>
-                        <pic:spPr>
-                          <a:xfrm>
-                            <a:off x="0" y="0"/>
-                            <a:ext cx="1248393" cy="772465"/>
-                          </a:xfrm>
-                          <a:prstGeom prst="rect">
-                            <a:avLst/>
-                          </a:prstGeom>
-                        </pic:spPr>
-                      </pic:pic>
-                    </a:graphicData>
-                  </a:graphic>
-                </wp:inline>
-              </w:drawing>
-            </w:r>
           </w:p>
         </w:tc>
       </w:tr>
@@ -693,13 +758,24 @@
                 <w:sz w:val="24"/>
                 <w:szCs w:val="24"/>
               </w:rPr>
-              <w:t>SMAN 1 Ciranjang</w:t>
-            </w:r>
+              <w:t xml:space="preserve">SMAN 1 </w:t>
+            </w:r>
+            <w:proofErr w:type="spellStart"/>
+            <w:r>
+              <w:rPr>
+                <w:rFonts w:ascii="Times New Roman" w:eastAsia="Times New Roman" w:hAnsi="Times New Roman" w:cs="Times New Roman"/>
+                <w:sz w:val="24"/>
+                <w:szCs w:val="24"/>
+              </w:rPr>
+              <w:t>Ciranjang</w:t>
+            </w:r>
+            <w:proofErr w:type="spellEnd"/>
           </w:p>
         </w:tc>
         <w:tc>
           <w:tcPr>
             <w:tcW w:w="1235" w:type="pct"/>
+            <w:vAlign w:val="center"/>
           </w:tcPr>
           <w:p>
             <w:pPr>
@@ -750,7 +826,25 @@
                 <w:szCs w:val="24"/>
               </w:rPr>
               <w:lastRenderedPageBreak/>
-              <w:t>Komputer seperti monitor, keyboard, dan mouse. Dan beberapa pengenalan Aplikasi yang sering digunakan dalam komputer untuk menunjang kebutuhan sehari-hari</w:t>
+              <w:t xml:space="preserve">Komputer seperti monitor, </w:t>
+            </w:r>
+            <w:proofErr w:type="spellStart"/>
+            <w:r>
+              <w:rPr>
+                <w:rFonts w:ascii="Times New Roman" w:eastAsia="Times New Roman" w:hAnsi="Times New Roman" w:cs="Times New Roman"/>
+                <w:sz w:val="24"/>
+                <w:szCs w:val="24"/>
+              </w:rPr>
+              <w:t>keyboard</w:t>
+            </w:r>
+            <w:proofErr w:type="spellEnd"/>
+            <w:r>
+              <w:rPr>
+                <w:rFonts w:ascii="Times New Roman" w:eastAsia="Times New Roman" w:hAnsi="Times New Roman" w:cs="Times New Roman"/>
+                <w:sz w:val="24"/>
+                <w:szCs w:val="24"/>
+              </w:rPr>
+              <w:t>, dan mouse. Dan beberapa pengenalan Aplikasi yang sering digunakan dalam komputer untuk menunjang kebutuhan sehari-hari</w:t>
             </w:r>
           </w:p>
         </w:tc>
@@ -766,66 +860,6 @@
                 <w:szCs w:val="24"/>
               </w:rPr>
             </w:pPr>
-            <w:r>
-              <w:rPr>
-                <w:rFonts w:ascii="Times New Roman" w:eastAsia="Times New Roman" w:hAnsi="Times New Roman" w:cs="Times New Roman"/>
-                <w:noProof/>
-                <w:sz w:val="24"/>
-                <w:szCs w:val="24"/>
-              </w:rPr>
-              <w:lastRenderedPageBreak/>
-              <w:drawing>
-                <wp:inline distT="0" distB="0" distL="0" distR="0" wp14:anchorId="6553C0DC" wp14:editId="432DB83C">
-                  <wp:extent cx="1237207" cy="765544"/>
-                  <wp:effectExtent l="0" t="0" r="1270" b="0"/>
-                  <wp:docPr id="706379835" name="Picture 1" descr="A signature on a white background&#10;&#10;AI-generated content may be incorrect."/>
-                  <wp:cNvGraphicFramePr>
-                    <a:graphicFrameLocks xmlns:a="http://schemas.openxmlformats.org/drawingml/2006/main" noChangeAspect="1"/>
-                  </wp:cNvGraphicFramePr>
-                  <a:graphic xmlns:a="http://schemas.openxmlformats.org/drawingml/2006/main">
-                    <a:graphicData uri="http://schemas.openxmlformats.org/drawingml/2006/picture">
-                      <pic:pic xmlns:pic="http://schemas.openxmlformats.org/drawingml/2006/picture">
-                        <pic:nvPicPr>
-                          <pic:cNvPr id="2014143181" name="Picture 1" descr="A signature on a white background&#10;&#10;AI-generated content may be incorrect."/>
-                          <pic:cNvPicPr/>
-                        </pic:nvPicPr>
-                        <pic:blipFill>
-                          <a:blip r:embed="rId6" cstate="print">
-                            <a:clrChange>
-                              <a:clrFrom>
-                                <a:srgbClr val="FFFFFF"/>
-                              </a:clrFrom>
-                              <a:clrTo>
-                                <a:srgbClr val="FFFFFF">
-                                  <a:alpha val="0"/>
-                                </a:srgbClr>
-                              </a:clrTo>
-                            </a:clrChange>
-                            <a:extLst>
-                              <a:ext uri="{28A0092B-C50C-407E-A947-70E740481C1C}">
-                                <a14:useLocalDpi xmlns:a14="http://schemas.microsoft.com/office/drawing/2010/main" val="0"/>
-                              </a:ext>
-                            </a:extLst>
-                          </a:blip>
-                          <a:stretch>
-                            <a:fillRect/>
-                          </a:stretch>
-                        </pic:blipFill>
-                        <pic:spPr>
-                          <a:xfrm>
-                            <a:off x="0" y="0"/>
-                            <a:ext cx="1248393" cy="772465"/>
-                          </a:xfrm>
-                          <a:prstGeom prst="rect">
-                            <a:avLst/>
-                          </a:prstGeom>
-                        </pic:spPr>
-                      </pic:pic>
-                    </a:graphicData>
-                  </a:graphic>
-                </wp:inline>
-              </w:drawing>
-            </w:r>
           </w:p>
         </w:tc>
       </w:tr>
@@ -917,8 +951,18 @@
                 <w:sz w:val="24"/>
                 <w:szCs w:val="24"/>
               </w:rPr>
-              <w:t>SMAN 1 Ciranjang</w:t>
-            </w:r>
+              <w:t xml:space="preserve">SMAN 1 </w:t>
+            </w:r>
+            <w:proofErr w:type="spellStart"/>
+            <w:r>
+              <w:rPr>
+                <w:rFonts w:ascii="Times New Roman" w:eastAsia="Times New Roman" w:hAnsi="Times New Roman" w:cs="Times New Roman"/>
+                <w:sz w:val="24"/>
+                <w:szCs w:val="24"/>
+              </w:rPr>
+              <w:t>Ciranjang</w:t>
+            </w:r>
+            <w:proofErr w:type="spellEnd"/>
           </w:p>
         </w:tc>
         <w:tc>
@@ -943,6 +987,7 @@
               </w:rPr>
               <w:t xml:space="preserve">Pengenalan Lebih lanjut terkait Hardware Komputer dan </w:t>
             </w:r>
+            <w:proofErr w:type="spellStart"/>
             <w:r>
               <w:rPr>
                 <w:rFonts w:ascii="Times New Roman" w:eastAsia="Times New Roman" w:hAnsi="Times New Roman" w:cs="Times New Roman"/>
@@ -951,6 +996,7 @@
               </w:rPr>
               <w:t>Troubleshooting</w:t>
             </w:r>
+            <w:proofErr w:type="spellEnd"/>
           </w:p>
         </w:tc>
         <w:tc>
@@ -973,7 +1019,25 @@
                 <w:sz w:val="24"/>
                 <w:szCs w:val="24"/>
               </w:rPr>
-              <w:t>Materi yang diajarkan mengenai Hardware komputer/Perangkat Keras komputer dan cara memperbaikinya apabila terjadi malfungsi. Materi diajarkan via ceramah, diskusi, praktik langsung, dan tanya jawab.</w:t>
+              <w:t xml:space="preserve">Materi yang diajarkan mengenai Hardware komputer/Perangkat Keras komputer dan cara memperbaikinya apabila terjadi </w:t>
+            </w:r>
+            <w:proofErr w:type="spellStart"/>
+            <w:r>
+              <w:rPr>
+                <w:rFonts w:ascii="Times New Roman" w:eastAsia="Times New Roman" w:hAnsi="Times New Roman" w:cs="Times New Roman"/>
+                <w:sz w:val="24"/>
+                <w:szCs w:val="24"/>
+              </w:rPr>
+              <w:t>malfungsi</w:t>
+            </w:r>
+            <w:proofErr w:type="spellEnd"/>
+            <w:r>
+              <w:rPr>
+                <w:rFonts w:ascii="Times New Roman" w:eastAsia="Times New Roman" w:hAnsi="Times New Roman" w:cs="Times New Roman"/>
+                <w:sz w:val="24"/>
+                <w:szCs w:val="24"/>
+              </w:rPr>
+              <w:t>. Materi diajarkan via ceramah, diskusi, praktik langsung, dan tanya jawab.</w:t>
             </w:r>
           </w:p>
         </w:tc>
@@ -989,65 +1053,6 @@
                 <w:szCs w:val="24"/>
               </w:rPr>
             </w:pPr>
-            <w:r>
-              <w:rPr>
-                <w:rFonts w:ascii="Times New Roman" w:eastAsia="Times New Roman" w:hAnsi="Times New Roman" w:cs="Times New Roman"/>
-                <w:noProof/>
-                <w:sz w:val="24"/>
-                <w:szCs w:val="24"/>
-              </w:rPr>
-              <w:drawing>
-                <wp:inline distT="0" distB="0" distL="0" distR="0" wp14:anchorId="5BB0F692" wp14:editId="420133D1">
-                  <wp:extent cx="1237207" cy="765544"/>
-                  <wp:effectExtent l="0" t="0" r="1270" b="0"/>
-                  <wp:docPr id="2052918737" name="Picture 1" descr="A signature on a white background&#10;&#10;AI-generated content may be incorrect."/>
-                  <wp:cNvGraphicFramePr>
-                    <a:graphicFrameLocks xmlns:a="http://schemas.openxmlformats.org/drawingml/2006/main" noChangeAspect="1"/>
-                  </wp:cNvGraphicFramePr>
-                  <a:graphic xmlns:a="http://schemas.openxmlformats.org/drawingml/2006/main">
-                    <a:graphicData uri="http://schemas.openxmlformats.org/drawingml/2006/picture">
-                      <pic:pic xmlns:pic="http://schemas.openxmlformats.org/drawingml/2006/picture">
-                        <pic:nvPicPr>
-                          <pic:cNvPr id="2014143181" name="Picture 1" descr="A signature on a white background&#10;&#10;AI-generated content may be incorrect."/>
-                          <pic:cNvPicPr/>
-                        </pic:nvPicPr>
-                        <pic:blipFill>
-                          <a:blip r:embed="rId6" cstate="print">
-                            <a:clrChange>
-                              <a:clrFrom>
-                                <a:srgbClr val="FFFFFF"/>
-                              </a:clrFrom>
-                              <a:clrTo>
-                                <a:srgbClr val="FFFFFF">
-                                  <a:alpha val="0"/>
-                                </a:srgbClr>
-                              </a:clrTo>
-                            </a:clrChange>
-                            <a:extLst>
-                              <a:ext uri="{28A0092B-C50C-407E-A947-70E740481C1C}">
-                                <a14:useLocalDpi xmlns:a14="http://schemas.microsoft.com/office/drawing/2010/main" val="0"/>
-                              </a:ext>
-                            </a:extLst>
-                          </a:blip>
-                          <a:stretch>
-                            <a:fillRect/>
-                          </a:stretch>
-                        </pic:blipFill>
-                        <pic:spPr>
-                          <a:xfrm>
-                            <a:off x="0" y="0"/>
-                            <a:ext cx="1248393" cy="772465"/>
-                          </a:xfrm>
-                          <a:prstGeom prst="rect">
-                            <a:avLst/>
-                          </a:prstGeom>
-                        </pic:spPr>
-                      </pic:pic>
-                    </a:graphicData>
-                  </a:graphic>
-                </wp:inline>
-              </w:drawing>
-            </w:r>
           </w:p>
         </w:tc>
       </w:tr>
@@ -1123,8 +1128,18 @@
                 <w:sz w:val="24"/>
                 <w:szCs w:val="24"/>
               </w:rPr>
-              <w:t>SMAN 1 Ciranjang</w:t>
-            </w:r>
+              <w:t xml:space="preserve">SMAN 1 </w:t>
+            </w:r>
+            <w:proofErr w:type="spellStart"/>
+            <w:r>
+              <w:rPr>
+                <w:rFonts w:ascii="Times New Roman" w:eastAsia="Times New Roman" w:hAnsi="Times New Roman" w:cs="Times New Roman"/>
+                <w:sz w:val="24"/>
+                <w:szCs w:val="24"/>
+              </w:rPr>
+              <w:t>Ciranjang</w:t>
+            </w:r>
+            <w:proofErr w:type="spellEnd"/>
           </w:p>
         </w:tc>
         <w:tc>
@@ -1187,65 +1202,6 @@
                 <w:szCs w:val="24"/>
               </w:rPr>
             </w:pPr>
-            <w:r>
-              <w:rPr>
-                <w:rFonts w:ascii="Times New Roman" w:eastAsia="Times New Roman" w:hAnsi="Times New Roman" w:cs="Times New Roman"/>
-                <w:noProof/>
-                <w:sz w:val="24"/>
-                <w:szCs w:val="24"/>
-              </w:rPr>
-              <w:drawing>
-                <wp:inline distT="0" distB="0" distL="0" distR="0" wp14:anchorId="26109C2A" wp14:editId="5C123828">
-                  <wp:extent cx="1237207" cy="765544"/>
-                  <wp:effectExtent l="0" t="0" r="1270" b="0"/>
-                  <wp:docPr id="849720503" name="Picture 1" descr="A signature on a white background&#10;&#10;AI-generated content may be incorrect."/>
-                  <wp:cNvGraphicFramePr>
-                    <a:graphicFrameLocks xmlns:a="http://schemas.openxmlformats.org/drawingml/2006/main" noChangeAspect="1"/>
-                  </wp:cNvGraphicFramePr>
-                  <a:graphic xmlns:a="http://schemas.openxmlformats.org/drawingml/2006/main">
-                    <a:graphicData uri="http://schemas.openxmlformats.org/drawingml/2006/picture">
-                      <pic:pic xmlns:pic="http://schemas.openxmlformats.org/drawingml/2006/picture">
-                        <pic:nvPicPr>
-                          <pic:cNvPr id="2014143181" name="Picture 1" descr="A signature on a white background&#10;&#10;AI-generated content may be incorrect."/>
-                          <pic:cNvPicPr/>
-                        </pic:nvPicPr>
-                        <pic:blipFill>
-                          <a:blip r:embed="rId6" cstate="print">
-                            <a:clrChange>
-                              <a:clrFrom>
-                                <a:srgbClr val="FFFFFF"/>
-                              </a:clrFrom>
-                              <a:clrTo>
-                                <a:srgbClr val="FFFFFF">
-                                  <a:alpha val="0"/>
-                                </a:srgbClr>
-                              </a:clrTo>
-                            </a:clrChange>
-                            <a:extLst>
-                              <a:ext uri="{28A0092B-C50C-407E-A947-70E740481C1C}">
-                                <a14:useLocalDpi xmlns:a14="http://schemas.microsoft.com/office/drawing/2010/main" val="0"/>
-                              </a:ext>
-                            </a:extLst>
-                          </a:blip>
-                          <a:stretch>
-                            <a:fillRect/>
-                          </a:stretch>
-                        </pic:blipFill>
-                        <pic:spPr>
-                          <a:xfrm>
-                            <a:off x="0" y="0"/>
-                            <a:ext cx="1248393" cy="772465"/>
-                          </a:xfrm>
-                          <a:prstGeom prst="rect">
-                            <a:avLst/>
-                          </a:prstGeom>
-                        </pic:spPr>
-                      </pic:pic>
-                    </a:graphicData>
-                  </a:graphic>
-                </wp:inline>
-              </w:drawing>
-            </w:r>
           </w:p>
         </w:tc>
       </w:tr>
@@ -1321,7 +1277,25 @@
                 <w:sz w:val="24"/>
                 <w:szCs w:val="24"/>
               </w:rPr>
-              <w:t xml:space="preserve">SMAN 1 Ciranjang </w:t>
+              <w:t xml:space="preserve">SMAN 1 </w:t>
+            </w:r>
+            <w:proofErr w:type="spellStart"/>
+            <w:r>
+              <w:rPr>
+                <w:rFonts w:ascii="Times New Roman" w:eastAsia="Times New Roman" w:hAnsi="Times New Roman" w:cs="Times New Roman"/>
+                <w:sz w:val="24"/>
+                <w:szCs w:val="24"/>
+              </w:rPr>
+              <w:t>Ciranjang</w:t>
+            </w:r>
+            <w:proofErr w:type="spellEnd"/>
+            <w:r>
+              <w:rPr>
+                <w:rFonts w:ascii="Times New Roman" w:eastAsia="Times New Roman" w:hAnsi="Times New Roman" w:cs="Times New Roman"/>
+                <w:sz w:val="24"/>
+                <w:szCs w:val="24"/>
+              </w:rPr>
+              <w:t xml:space="preserve"> </w:t>
             </w:r>
           </w:p>
         </w:tc>
@@ -1378,7 +1352,61 @@
                 <w:szCs w:val="24"/>
               </w:rPr>
               <w:lastRenderedPageBreak/>
-              <w:t>sebuah diagram/chart di word, lalu membuat tulisan menarik di WordArt, dan lain-lain. Dasar-dasar Ms. Excel belajar cara mengolah data baik berupa angka maupun huruf. Materi yang diajarkan via Ceramah, Diskusi, Tanya jawab, dan praktik langsung di komputer.</w:t>
+              <w:t>sebuah diagram/</w:t>
+            </w:r>
+            <w:proofErr w:type="spellStart"/>
+            <w:r>
+              <w:rPr>
+                <w:rFonts w:ascii="Times New Roman" w:eastAsia="Times New Roman" w:hAnsi="Times New Roman" w:cs="Times New Roman"/>
+                <w:sz w:val="24"/>
+                <w:szCs w:val="24"/>
+              </w:rPr>
+              <w:t>chart</w:t>
+            </w:r>
+            <w:proofErr w:type="spellEnd"/>
+            <w:r>
+              <w:rPr>
+                <w:rFonts w:ascii="Times New Roman" w:eastAsia="Times New Roman" w:hAnsi="Times New Roman" w:cs="Times New Roman"/>
+                <w:sz w:val="24"/>
+                <w:szCs w:val="24"/>
+              </w:rPr>
+              <w:t xml:space="preserve"> di </w:t>
+            </w:r>
+            <w:proofErr w:type="spellStart"/>
+            <w:r>
+              <w:rPr>
+                <w:rFonts w:ascii="Times New Roman" w:eastAsia="Times New Roman" w:hAnsi="Times New Roman" w:cs="Times New Roman"/>
+                <w:sz w:val="24"/>
+                <w:szCs w:val="24"/>
+              </w:rPr>
+              <w:t>word</w:t>
+            </w:r>
+            <w:proofErr w:type="spellEnd"/>
+            <w:r>
+              <w:rPr>
+                <w:rFonts w:ascii="Times New Roman" w:eastAsia="Times New Roman" w:hAnsi="Times New Roman" w:cs="Times New Roman"/>
+                <w:sz w:val="24"/>
+                <w:szCs w:val="24"/>
+              </w:rPr>
+              <w:t xml:space="preserve">, lalu membuat tulisan menarik di </w:t>
+            </w:r>
+            <w:proofErr w:type="spellStart"/>
+            <w:r>
+              <w:rPr>
+                <w:rFonts w:ascii="Times New Roman" w:eastAsia="Times New Roman" w:hAnsi="Times New Roman" w:cs="Times New Roman"/>
+                <w:sz w:val="24"/>
+                <w:szCs w:val="24"/>
+              </w:rPr>
+              <w:t>WordArt</w:t>
+            </w:r>
+            <w:proofErr w:type="spellEnd"/>
+            <w:r>
+              <w:rPr>
+                <w:rFonts w:ascii="Times New Roman" w:eastAsia="Times New Roman" w:hAnsi="Times New Roman" w:cs="Times New Roman"/>
+                <w:sz w:val="24"/>
+                <w:szCs w:val="24"/>
+              </w:rPr>
+              <w:t>, dan lain-lain. Dasar-dasar Ms. Excel belajar cara mengolah data baik berupa angka maupun huruf. Materi yang diajarkan via Ceramah, Diskusi, Tanya jawab, dan praktik langsung di komputer.</w:t>
             </w:r>
           </w:p>
         </w:tc>
@@ -1394,66 +1422,6 @@
                 <w:szCs w:val="24"/>
               </w:rPr>
             </w:pPr>
-            <w:r>
-              <w:rPr>
-                <w:rFonts w:ascii="Times New Roman" w:eastAsia="Times New Roman" w:hAnsi="Times New Roman" w:cs="Times New Roman"/>
-                <w:noProof/>
-                <w:sz w:val="24"/>
-                <w:szCs w:val="24"/>
-              </w:rPr>
-              <w:lastRenderedPageBreak/>
-              <w:drawing>
-                <wp:inline distT="0" distB="0" distL="0" distR="0" wp14:anchorId="3028D0E4" wp14:editId="4F251137">
-                  <wp:extent cx="1237207" cy="765544"/>
-                  <wp:effectExtent l="0" t="0" r="1270" b="0"/>
-                  <wp:docPr id="1409779347" name="Picture 1" descr="A signature on a white background&#10;&#10;AI-generated content may be incorrect."/>
-                  <wp:cNvGraphicFramePr>
-                    <a:graphicFrameLocks xmlns:a="http://schemas.openxmlformats.org/drawingml/2006/main" noChangeAspect="1"/>
-                  </wp:cNvGraphicFramePr>
-                  <a:graphic xmlns:a="http://schemas.openxmlformats.org/drawingml/2006/main">
-                    <a:graphicData uri="http://schemas.openxmlformats.org/drawingml/2006/picture">
-                      <pic:pic xmlns:pic="http://schemas.openxmlformats.org/drawingml/2006/picture">
-                        <pic:nvPicPr>
-                          <pic:cNvPr id="2014143181" name="Picture 1" descr="A signature on a white background&#10;&#10;AI-generated content may be incorrect."/>
-                          <pic:cNvPicPr/>
-                        </pic:nvPicPr>
-                        <pic:blipFill>
-                          <a:blip r:embed="rId6" cstate="print">
-                            <a:clrChange>
-                              <a:clrFrom>
-                                <a:srgbClr val="FFFFFF"/>
-                              </a:clrFrom>
-                              <a:clrTo>
-                                <a:srgbClr val="FFFFFF">
-                                  <a:alpha val="0"/>
-                                </a:srgbClr>
-                              </a:clrTo>
-                            </a:clrChange>
-                            <a:extLst>
-                              <a:ext uri="{28A0092B-C50C-407E-A947-70E740481C1C}">
-                                <a14:useLocalDpi xmlns:a14="http://schemas.microsoft.com/office/drawing/2010/main" val="0"/>
-                              </a:ext>
-                            </a:extLst>
-                          </a:blip>
-                          <a:stretch>
-                            <a:fillRect/>
-                          </a:stretch>
-                        </pic:blipFill>
-                        <pic:spPr>
-                          <a:xfrm>
-                            <a:off x="0" y="0"/>
-                            <a:ext cx="1248393" cy="772465"/>
-                          </a:xfrm>
-                          <a:prstGeom prst="rect">
-                            <a:avLst/>
-                          </a:prstGeom>
-                        </pic:spPr>
-                      </pic:pic>
-                    </a:graphicData>
-                  </a:graphic>
-                </wp:inline>
-              </w:drawing>
-            </w:r>
           </w:p>
         </w:tc>
       </w:tr>
@@ -1468,9 +1436,9 @@
           <w:szCs w:val="24"/>
         </w:rPr>
         <w:sectPr>
-          <w:headerReference w:type="even" r:id="rId7"/>
-          <w:headerReference w:type="default" r:id="rId8"/>
-          <w:footerReference w:type="default" r:id="rId9"/>
+          <w:headerReference w:type="even" r:id="rId6"/>
+          <w:headerReference w:type="default" r:id="rId7"/>
+          <w:footerReference w:type="default" r:id="rId8"/>
           <w:pgSz w:w="11906" w:h="16838"/>
           <w:pgMar w:top="1440" w:right="1440" w:bottom="1440" w:left="1440" w:header="708" w:footer="708" w:gutter="0"/>
           <w:pgNumType w:start="1"/>
@@ -2058,6 +2026,7 @@
                 <w:szCs w:val="24"/>
               </w:rPr>
             </w:pPr>
+            <w:proofErr w:type="spellStart"/>
             <w:r>
               <w:rPr>
                 <w:rFonts w:ascii="Times New Roman" w:hAnsi="Times New Roman" w:cs="Times New Roman"/>
@@ -2067,6 +2036,7 @@
               </w:rPr>
               <w:t>Safiraturahmah</w:t>
             </w:r>
+            <w:proofErr w:type="spellEnd"/>
           </w:p>
         </w:tc>
         <w:tc>
@@ -3914,8 +3884,19 @@
                 <w:sz w:val="24"/>
                 <w:szCs w:val="24"/>
               </w:rPr>
-              <w:t>Alika Kanzhania</w:t>
-            </w:r>
+              <w:t xml:space="preserve">Alika </w:t>
+            </w:r>
+            <w:proofErr w:type="spellStart"/>
+            <w:r>
+              <w:rPr>
+                <w:rFonts w:ascii="Times New Roman" w:hAnsi="Times New Roman" w:cs="Times New Roman"/>
+                <w:color w:val="000000"/>
+                <w:sz w:val="24"/>
+                <w:szCs w:val="24"/>
+              </w:rPr>
+              <w:t>Kanzhania</w:t>
+            </w:r>
+            <w:proofErr w:type="spellEnd"/>
           </w:p>
         </w:tc>
         <w:tc>
@@ -4077,7 +4058,27 @@
                 <w:sz w:val="24"/>
                 <w:szCs w:val="24"/>
               </w:rPr>
-              <w:t>Dariel Tifatul Aprilio</w:t>
+              <w:t xml:space="preserve">Dariel </w:t>
+            </w:r>
+            <w:proofErr w:type="spellStart"/>
+            <w:r>
+              <w:rPr>
+                <w:rFonts w:ascii="Times New Roman" w:hAnsi="Times New Roman" w:cs="Times New Roman"/>
+                <w:color w:val="000000"/>
+                <w:sz w:val="24"/>
+                <w:szCs w:val="24"/>
+              </w:rPr>
+              <w:t>Tifatul</w:t>
+            </w:r>
+            <w:proofErr w:type="spellEnd"/>
+            <w:r>
+              <w:rPr>
+                <w:rFonts w:ascii="Times New Roman" w:hAnsi="Times New Roman" w:cs="Times New Roman"/>
+                <w:color w:val="000000"/>
+                <w:sz w:val="24"/>
+                <w:szCs w:val="24"/>
+              </w:rPr>
+              <w:t xml:space="preserve"> Aprilio</w:t>
             </w:r>
           </w:p>
         </w:tc>
@@ -4927,14 +4928,45 @@
                 <w:szCs w:val="24"/>
               </w:rPr>
             </w:pPr>
-            <w:r>
-              <w:rPr>
-                <w:rFonts w:ascii="Times New Roman" w:hAnsi="Times New Roman" w:cs="Times New Roman"/>
-                <w:color w:val="000000"/>
-                <w:sz w:val="24"/>
-                <w:szCs w:val="24"/>
-              </w:rPr>
-              <w:t>Heden Zena Rafli</w:t>
+            <w:proofErr w:type="spellStart"/>
+            <w:r>
+              <w:rPr>
+                <w:rFonts w:ascii="Times New Roman" w:hAnsi="Times New Roman" w:cs="Times New Roman"/>
+                <w:color w:val="000000"/>
+                <w:sz w:val="24"/>
+                <w:szCs w:val="24"/>
+              </w:rPr>
+              <w:t>Heden</w:t>
+            </w:r>
+            <w:proofErr w:type="spellEnd"/>
+            <w:r>
+              <w:rPr>
+                <w:rFonts w:ascii="Times New Roman" w:hAnsi="Times New Roman" w:cs="Times New Roman"/>
+                <w:color w:val="000000"/>
+                <w:sz w:val="24"/>
+                <w:szCs w:val="24"/>
+              </w:rPr>
+              <w:t xml:space="preserve"> </w:t>
+            </w:r>
+            <w:proofErr w:type="spellStart"/>
+            <w:r>
+              <w:rPr>
+                <w:rFonts w:ascii="Times New Roman" w:hAnsi="Times New Roman" w:cs="Times New Roman"/>
+                <w:color w:val="000000"/>
+                <w:sz w:val="24"/>
+                <w:szCs w:val="24"/>
+              </w:rPr>
+              <w:t>Zena</w:t>
+            </w:r>
+            <w:proofErr w:type="spellEnd"/>
+            <w:r>
+              <w:rPr>
+                <w:rFonts w:ascii="Times New Roman" w:hAnsi="Times New Roman" w:cs="Times New Roman"/>
+                <w:color w:val="000000"/>
+                <w:sz w:val="24"/>
+                <w:szCs w:val="24"/>
+              </w:rPr>
+              <w:t xml:space="preserve"> Rafli</w:t>
             </w:r>
           </w:p>
         </w:tc>
@@ -5276,8 +5308,39 @@
                 <w:sz w:val="24"/>
                 <w:szCs w:val="24"/>
               </w:rPr>
-              <w:t>Siti Sayla Zulfahira</w:t>
-            </w:r>
+              <w:t xml:space="preserve">Siti </w:t>
+            </w:r>
+            <w:proofErr w:type="spellStart"/>
+            <w:r>
+              <w:rPr>
+                <w:rFonts w:ascii="Times New Roman" w:hAnsi="Times New Roman" w:cs="Times New Roman"/>
+                <w:color w:val="000000"/>
+                <w:sz w:val="24"/>
+                <w:szCs w:val="24"/>
+              </w:rPr>
+              <w:t>Sayla</w:t>
+            </w:r>
+            <w:proofErr w:type="spellEnd"/>
+            <w:r>
+              <w:rPr>
+                <w:rFonts w:ascii="Times New Roman" w:hAnsi="Times New Roman" w:cs="Times New Roman"/>
+                <w:color w:val="000000"/>
+                <w:sz w:val="24"/>
+                <w:szCs w:val="24"/>
+              </w:rPr>
+              <w:t xml:space="preserve"> </w:t>
+            </w:r>
+            <w:proofErr w:type="spellStart"/>
+            <w:r>
+              <w:rPr>
+                <w:rFonts w:ascii="Times New Roman" w:hAnsi="Times New Roman" w:cs="Times New Roman"/>
+                <w:color w:val="000000"/>
+                <w:sz w:val="24"/>
+                <w:szCs w:val="24"/>
+              </w:rPr>
+              <w:t>Zulfahira</w:t>
+            </w:r>
+            <w:proofErr w:type="spellEnd"/>
           </w:p>
         </w:tc>
         <w:tc>
@@ -5424,14 +5487,25 @@
                 <w:szCs w:val="24"/>
               </w:rPr>
             </w:pPr>
-            <w:r>
-              <w:rPr>
-                <w:rFonts w:ascii="Times New Roman" w:hAnsi="Times New Roman" w:cs="Times New Roman"/>
-                <w:color w:val="000000"/>
-                <w:sz w:val="24"/>
-                <w:szCs w:val="24"/>
-              </w:rPr>
-              <w:t>Kanaya Siti</w:t>
+            <w:proofErr w:type="spellStart"/>
+            <w:r>
+              <w:rPr>
+                <w:rFonts w:ascii="Times New Roman" w:hAnsi="Times New Roman" w:cs="Times New Roman"/>
+                <w:color w:val="000000"/>
+                <w:sz w:val="24"/>
+                <w:szCs w:val="24"/>
+              </w:rPr>
+              <w:t>Kanaya</w:t>
+            </w:r>
+            <w:proofErr w:type="spellEnd"/>
+            <w:r>
+              <w:rPr>
+                <w:rFonts w:ascii="Times New Roman" w:hAnsi="Times New Roman" w:cs="Times New Roman"/>
+                <w:color w:val="000000"/>
+                <w:sz w:val="24"/>
+                <w:szCs w:val="24"/>
+              </w:rPr>
+              <w:t xml:space="preserve"> Siti</w:t>
             </w:r>
           </w:p>
         </w:tc>
@@ -5618,8 +5692,39 @@
                 <w:sz w:val="24"/>
                 <w:szCs w:val="24"/>
               </w:rPr>
-              <w:t>M Binekas Prayata</w:t>
-            </w:r>
+              <w:t xml:space="preserve">M </w:t>
+            </w:r>
+            <w:proofErr w:type="spellStart"/>
+            <w:r>
+              <w:rPr>
+                <w:rFonts w:ascii="Times New Roman" w:hAnsi="Times New Roman" w:cs="Times New Roman"/>
+                <w:color w:val="000000"/>
+                <w:sz w:val="24"/>
+                <w:szCs w:val="24"/>
+              </w:rPr>
+              <w:t>Binekas</w:t>
+            </w:r>
+            <w:proofErr w:type="spellEnd"/>
+            <w:r>
+              <w:rPr>
+                <w:rFonts w:ascii="Times New Roman" w:hAnsi="Times New Roman" w:cs="Times New Roman"/>
+                <w:color w:val="000000"/>
+                <w:sz w:val="24"/>
+                <w:szCs w:val="24"/>
+              </w:rPr>
+              <w:t xml:space="preserve"> </w:t>
+            </w:r>
+            <w:proofErr w:type="spellStart"/>
+            <w:r>
+              <w:rPr>
+                <w:rFonts w:ascii="Times New Roman" w:hAnsi="Times New Roman" w:cs="Times New Roman"/>
+                <w:color w:val="000000"/>
+                <w:sz w:val="24"/>
+                <w:szCs w:val="24"/>
+              </w:rPr>
+              <w:t>Prayata</w:t>
+            </w:r>
+            <w:proofErr w:type="spellEnd"/>
           </w:p>
         </w:tc>
         <w:tc>
@@ -5799,8 +5904,19 @@
                 <w:szCs w:val="24"/>
               </w:rPr>
               <w:lastRenderedPageBreak/>
-              <w:t>Muhammad Alwi Attijani</w:t>
-            </w:r>
+              <w:t xml:space="preserve">Muhammad Alwi </w:t>
+            </w:r>
+            <w:proofErr w:type="spellStart"/>
+            <w:r>
+              <w:rPr>
+                <w:rFonts w:ascii="Times New Roman" w:hAnsi="Times New Roman" w:cs="Times New Roman"/>
+                <w:color w:val="000000"/>
+                <w:sz w:val="24"/>
+                <w:szCs w:val="24"/>
+              </w:rPr>
+              <w:t>Attijani</w:t>
+            </w:r>
+            <w:proofErr w:type="spellEnd"/>
           </w:p>
         </w:tc>
         <w:tc>
@@ -5954,8 +6070,19 @@
                 <w:sz w:val="24"/>
                 <w:szCs w:val="24"/>
               </w:rPr>
-              <w:t>Abdurrahman Mumtaz</w:t>
-            </w:r>
+              <w:t xml:space="preserve">Abdurrahman </w:t>
+            </w:r>
+            <w:proofErr w:type="spellStart"/>
+            <w:r>
+              <w:rPr>
+                <w:rFonts w:ascii="Times New Roman" w:hAnsi="Times New Roman" w:cs="Times New Roman"/>
+                <w:color w:val="000000"/>
+                <w:sz w:val="24"/>
+                <w:szCs w:val="24"/>
+              </w:rPr>
+              <w:t>Mumtaz</w:t>
+            </w:r>
+            <w:proofErr w:type="spellEnd"/>
           </w:p>
         </w:tc>
         <w:tc>
@@ -6623,14 +6750,25 @@
                 <w:szCs w:val="24"/>
               </w:rPr>
             </w:pPr>
-            <w:r>
-              <w:rPr>
-                <w:rFonts w:ascii="Times New Roman" w:hAnsi="Times New Roman" w:cs="Times New Roman"/>
-                <w:color w:val="000000"/>
-                <w:sz w:val="24"/>
-                <w:szCs w:val="24"/>
-              </w:rPr>
-              <w:t>Keyza Cinta Putri Malia</w:t>
+            <w:proofErr w:type="spellStart"/>
+            <w:r>
+              <w:rPr>
+                <w:rFonts w:ascii="Times New Roman" w:hAnsi="Times New Roman" w:cs="Times New Roman"/>
+                <w:color w:val="000000"/>
+                <w:sz w:val="24"/>
+                <w:szCs w:val="24"/>
+              </w:rPr>
+              <w:t>Keyza</w:t>
+            </w:r>
+            <w:proofErr w:type="spellEnd"/>
+            <w:r>
+              <w:rPr>
+                <w:rFonts w:ascii="Times New Roman" w:hAnsi="Times New Roman" w:cs="Times New Roman"/>
+                <w:color w:val="000000"/>
+                <w:sz w:val="24"/>
+                <w:szCs w:val="24"/>
+              </w:rPr>
+              <w:t xml:space="preserve"> Cinta Putri Malia</w:t>
             </w:r>
           </w:p>
         </w:tc>
@@ -6809,8 +6947,19 @@
                 <w:sz w:val="24"/>
                 <w:szCs w:val="24"/>
               </w:rPr>
-              <w:t>Dede Siham</w:t>
-            </w:r>
+              <w:t xml:space="preserve">Dede </w:t>
+            </w:r>
+            <w:proofErr w:type="spellStart"/>
+            <w:r>
+              <w:rPr>
+                <w:rFonts w:ascii="Times New Roman" w:hAnsi="Times New Roman" w:cs="Times New Roman"/>
+                <w:color w:val="000000"/>
+                <w:sz w:val="24"/>
+                <w:szCs w:val="24"/>
+              </w:rPr>
+              <w:t>Siham</w:t>
+            </w:r>
+            <w:proofErr w:type="spellEnd"/>
           </w:p>
         </w:tc>
         <w:tc>
@@ -7299,8 +7448,19 @@
                 <w:sz w:val="24"/>
                 <w:szCs w:val="24"/>
               </w:rPr>
-              <w:t>Fajrin Isnainfacshyadz</w:t>
-            </w:r>
+              <w:t xml:space="preserve">Fajrin </w:t>
+            </w:r>
+            <w:proofErr w:type="spellStart"/>
+            <w:r>
+              <w:rPr>
+                <w:rFonts w:ascii="Times New Roman" w:hAnsi="Times New Roman" w:cs="Times New Roman"/>
+                <w:color w:val="000000"/>
+                <w:sz w:val="24"/>
+                <w:szCs w:val="24"/>
+              </w:rPr>
+              <w:t>Isnainfacshyadz</w:t>
+            </w:r>
+            <w:proofErr w:type="spellEnd"/>
           </w:p>
         </w:tc>
         <w:tc>
@@ -7644,7 +7804,27 @@
                 <w:sz w:val="24"/>
                 <w:szCs w:val="24"/>
               </w:rPr>
-              <w:t>M. Nazril Al Munawir</w:t>
+              <w:t xml:space="preserve">M. </w:t>
+            </w:r>
+            <w:proofErr w:type="spellStart"/>
+            <w:r>
+              <w:rPr>
+                <w:rFonts w:ascii="Times New Roman" w:hAnsi="Times New Roman" w:cs="Times New Roman"/>
+                <w:color w:val="000000"/>
+                <w:sz w:val="24"/>
+                <w:szCs w:val="24"/>
+              </w:rPr>
+              <w:t>Nazril</w:t>
+            </w:r>
+            <w:proofErr w:type="spellEnd"/>
+            <w:r>
+              <w:rPr>
+                <w:rFonts w:ascii="Times New Roman" w:hAnsi="Times New Roman" w:cs="Times New Roman"/>
+                <w:color w:val="000000"/>
+                <w:sz w:val="24"/>
+                <w:szCs w:val="24"/>
+              </w:rPr>
+              <w:t xml:space="preserve"> Al Munawir</w:t>
             </w:r>
           </w:p>
         </w:tc>
@@ -7994,8 +8174,19 @@
                 <w:sz w:val="24"/>
                 <w:szCs w:val="24"/>
               </w:rPr>
-              <w:t>Hana Ferlyani</w:t>
-            </w:r>
+              <w:t xml:space="preserve">Hana </w:t>
+            </w:r>
+            <w:proofErr w:type="spellStart"/>
+            <w:r>
+              <w:rPr>
+                <w:rFonts w:ascii="Times New Roman" w:hAnsi="Times New Roman" w:cs="Times New Roman"/>
+                <w:color w:val="000000"/>
+                <w:sz w:val="24"/>
+                <w:szCs w:val="24"/>
+              </w:rPr>
+              <w:t>Ferlyani</w:t>
+            </w:r>
+            <w:proofErr w:type="spellEnd"/>
           </w:p>
         </w:tc>
         <w:tc>
@@ -9175,8 +9366,19 @@
                 <w:sz w:val="24"/>
                 <w:szCs w:val="24"/>
               </w:rPr>
-              <w:t>Dinda Siti Jenab</w:t>
-            </w:r>
+              <w:t xml:space="preserve">Dinda Siti </w:t>
+            </w:r>
+            <w:proofErr w:type="spellStart"/>
+            <w:r>
+              <w:rPr>
+                <w:rFonts w:ascii="Times New Roman" w:hAnsi="Times New Roman" w:cs="Times New Roman"/>
+                <w:color w:val="000000"/>
+                <w:sz w:val="24"/>
+                <w:szCs w:val="24"/>
+              </w:rPr>
+              <w:t>Jenab</w:t>
+            </w:r>
+            <w:proofErr w:type="spellEnd"/>
           </w:p>
         </w:tc>
         <w:tc>
@@ -9497,14 +9699,25 @@
                 <w:szCs w:val="24"/>
               </w:rPr>
             </w:pPr>
-            <w:r>
-              <w:rPr>
-                <w:rFonts w:ascii="Times New Roman" w:hAnsi="Times New Roman" w:cs="Times New Roman"/>
-                <w:color w:val="000000"/>
-                <w:sz w:val="24"/>
-                <w:szCs w:val="24"/>
-              </w:rPr>
-              <w:t>Marshya Miracle</w:t>
+            <w:proofErr w:type="spellStart"/>
+            <w:r>
+              <w:rPr>
+                <w:rFonts w:ascii="Times New Roman" w:hAnsi="Times New Roman" w:cs="Times New Roman"/>
+                <w:color w:val="000000"/>
+                <w:sz w:val="24"/>
+                <w:szCs w:val="24"/>
+              </w:rPr>
+              <w:t>Marshya</w:t>
+            </w:r>
+            <w:proofErr w:type="spellEnd"/>
+            <w:r>
+              <w:rPr>
+                <w:rFonts w:ascii="Times New Roman" w:hAnsi="Times New Roman" w:cs="Times New Roman"/>
+                <w:color w:val="000000"/>
+                <w:sz w:val="24"/>
+                <w:szCs w:val="24"/>
+              </w:rPr>
+              <w:t xml:space="preserve"> Miracle</w:t>
             </w:r>
           </w:p>
         </w:tc>
@@ -9852,8 +10065,19 @@
                 <w:sz w:val="24"/>
                 <w:szCs w:val="24"/>
               </w:rPr>
-              <w:t>Danu Ardhi Pradityo</w:t>
-            </w:r>
+              <w:t xml:space="preserve">Danu Ardhi </w:t>
+            </w:r>
+            <w:proofErr w:type="spellStart"/>
+            <w:r>
+              <w:rPr>
+                <w:rFonts w:ascii="Times New Roman" w:hAnsi="Times New Roman" w:cs="Times New Roman"/>
+                <w:color w:val="000000"/>
+                <w:sz w:val="24"/>
+                <w:szCs w:val="24"/>
+              </w:rPr>
+              <w:t>Pradityo</w:t>
+            </w:r>
+            <w:proofErr w:type="spellEnd"/>
           </w:p>
         </w:tc>
         <w:tc>
@@ -10170,7 +10394,47 @@
                 <w:sz w:val="24"/>
                 <w:szCs w:val="24"/>
               </w:rPr>
-              <w:t xml:space="preserve">Zahra Rofa Saefatumilah </w:t>
+              <w:t xml:space="preserve">Zahra </w:t>
+            </w:r>
+            <w:proofErr w:type="spellStart"/>
+            <w:r>
+              <w:rPr>
+                <w:rFonts w:ascii="Times New Roman" w:hAnsi="Times New Roman" w:cs="Times New Roman"/>
+                <w:color w:val="000000"/>
+                <w:sz w:val="24"/>
+                <w:szCs w:val="24"/>
+              </w:rPr>
+              <w:t>Rofa</w:t>
+            </w:r>
+            <w:proofErr w:type="spellEnd"/>
+            <w:r>
+              <w:rPr>
+                <w:rFonts w:ascii="Times New Roman" w:hAnsi="Times New Roman" w:cs="Times New Roman"/>
+                <w:color w:val="000000"/>
+                <w:sz w:val="24"/>
+                <w:szCs w:val="24"/>
+              </w:rPr>
+              <w:t xml:space="preserve"> </w:t>
+            </w:r>
+            <w:proofErr w:type="spellStart"/>
+            <w:r>
+              <w:rPr>
+                <w:rFonts w:ascii="Times New Roman" w:hAnsi="Times New Roman" w:cs="Times New Roman"/>
+                <w:color w:val="000000"/>
+                <w:sz w:val="24"/>
+                <w:szCs w:val="24"/>
+              </w:rPr>
+              <w:t>Saefatumilah</w:t>
+            </w:r>
+            <w:proofErr w:type="spellEnd"/>
+            <w:r>
+              <w:rPr>
+                <w:rFonts w:ascii="Times New Roman" w:hAnsi="Times New Roman" w:cs="Times New Roman"/>
+                <w:color w:val="000000"/>
+                <w:sz w:val="24"/>
+                <w:szCs w:val="24"/>
+              </w:rPr>
+              <w:t xml:space="preserve"> </w:t>
             </w:r>
           </w:p>
         </w:tc>
@@ -10514,7 +10778,27 @@
                 <w:sz w:val="24"/>
                 <w:szCs w:val="24"/>
               </w:rPr>
-              <w:t>Nida Khofiyya Fauziah</w:t>
+              <w:t xml:space="preserve">Nida </w:t>
+            </w:r>
+            <w:proofErr w:type="spellStart"/>
+            <w:r>
+              <w:rPr>
+                <w:rFonts w:ascii="Times New Roman" w:hAnsi="Times New Roman" w:cs="Times New Roman"/>
+                <w:color w:val="000000"/>
+                <w:sz w:val="24"/>
+                <w:szCs w:val="24"/>
+              </w:rPr>
+              <w:t>Khofiyya</w:t>
+            </w:r>
+            <w:proofErr w:type="spellEnd"/>
+            <w:r>
+              <w:rPr>
+                <w:rFonts w:ascii="Times New Roman" w:hAnsi="Times New Roman" w:cs="Times New Roman"/>
+                <w:color w:val="000000"/>
+                <w:sz w:val="24"/>
+                <w:szCs w:val="24"/>
+              </w:rPr>
+              <w:t xml:space="preserve"> Fauziah</w:t>
             </w:r>
           </w:p>
         </w:tc>
@@ -10667,14 +10951,25 @@
                 <w:szCs w:val="24"/>
               </w:rPr>
             </w:pPr>
-            <w:r>
-              <w:rPr>
-                <w:rFonts w:ascii="Times New Roman" w:hAnsi="Times New Roman" w:cs="Times New Roman"/>
-                <w:color w:val="000000"/>
-                <w:sz w:val="24"/>
-                <w:szCs w:val="24"/>
-              </w:rPr>
-              <w:t>Kazzeta Oktavia S</w:t>
+            <w:proofErr w:type="spellStart"/>
+            <w:r>
+              <w:rPr>
+                <w:rFonts w:ascii="Times New Roman" w:hAnsi="Times New Roman" w:cs="Times New Roman"/>
+                <w:color w:val="000000"/>
+                <w:sz w:val="24"/>
+                <w:szCs w:val="24"/>
+              </w:rPr>
+              <w:t>Kazzeta</w:t>
+            </w:r>
+            <w:proofErr w:type="spellEnd"/>
+            <w:r>
+              <w:rPr>
+                <w:rFonts w:ascii="Times New Roman" w:hAnsi="Times New Roman" w:cs="Times New Roman"/>
+                <w:color w:val="000000"/>
+                <w:sz w:val="24"/>
+                <w:szCs w:val="24"/>
+              </w:rPr>
+              <w:t xml:space="preserve"> Oktavia S</w:t>
             </w:r>
           </w:p>
         </w:tc>
@@ -10826,14 +11121,25 @@
                 <w:szCs w:val="24"/>
               </w:rPr>
             </w:pPr>
-            <w:r>
-              <w:rPr>
-                <w:rFonts w:ascii="Times New Roman" w:hAnsi="Times New Roman" w:cs="Times New Roman"/>
-                <w:color w:val="000000"/>
-                <w:sz w:val="24"/>
-                <w:szCs w:val="24"/>
-              </w:rPr>
-              <w:t>Nea Febriyanti</w:t>
+            <w:proofErr w:type="spellStart"/>
+            <w:r>
+              <w:rPr>
+                <w:rFonts w:ascii="Times New Roman" w:hAnsi="Times New Roman" w:cs="Times New Roman"/>
+                <w:color w:val="000000"/>
+                <w:sz w:val="24"/>
+                <w:szCs w:val="24"/>
+              </w:rPr>
+              <w:t>Nea</w:t>
+            </w:r>
+            <w:proofErr w:type="spellEnd"/>
+            <w:r>
+              <w:rPr>
+                <w:rFonts w:ascii="Times New Roman" w:hAnsi="Times New Roman" w:cs="Times New Roman"/>
+                <w:color w:val="000000"/>
+                <w:sz w:val="24"/>
+                <w:szCs w:val="24"/>
+              </w:rPr>
+              <w:t xml:space="preserve"> Febriyanti</w:t>
             </w:r>
           </w:p>
         </w:tc>
@@ -10992,7 +11298,27 @@
                 <w:sz w:val="24"/>
                 <w:szCs w:val="24"/>
               </w:rPr>
-              <w:t>Kenzy Rafaela Alhasby Nasution</w:t>
+              <w:t xml:space="preserve">Kenzy </w:t>
+            </w:r>
+            <w:proofErr w:type="spellStart"/>
+            <w:r>
+              <w:rPr>
+                <w:rFonts w:ascii="Times New Roman" w:hAnsi="Times New Roman" w:cs="Times New Roman"/>
+                <w:color w:val="000000"/>
+                <w:sz w:val="24"/>
+                <w:szCs w:val="24"/>
+              </w:rPr>
+              <w:t>Rafaela</w:t>
+            </w:r>
+            <w:proofErr w:type="spellEnd"/>
+            <w:r>
+              <w:rPr>
+                <w:rFonts w:ascii="Times New Roman" w:hAnsi="Times New Roman" w:cs="Times New Roman"/>
+                <w:color w:val="000000"/>
+                <w:sz w:val="24"/>
+                <w:szCs w:val="24"/>
+              </w:rPr>
+              <w:t xml:space="preserve"> Alhasby Nasution</w:t>
             </w:r>
           </w:p>
         </w:tc>
@@ -11477,14 +11803,25 @@
                 <w:szCs w:val="24"/>
               </w:rPr>
             </w:pPr>
-            <w:r>
-              <w:rPr>
-                <w:rFonts w:ascii="Times New Roman" w:hAnsi="Times New Roman" w:cs="Times New Roman"/>
-                <w:color w:val="000000"/>
-                <w:sz w:val="24"/>
-                <w:szCs w:val="24"/>
-              </w:rPr>
-              <w:t>Kazetta Oktavia</w:t>
+            <w:proofErr w:type="spellStart"/>
+            <w:r>
+              <w:rPr>
+                <w:rFonts w:ascii="Times New Roman" w:hAnsi="Times New Roman" w:cs="Times New Roman"/>
+                <w:color w:val="000000"/>
+                <w:sz w:val="24"/>
+                <w:szCs w:val="24"/>
+              </w:rPr>
+              <w:t>Kazetta</w:t>
+            </w:r>
+            <w:proofErr w:type="spellEnd"/>
+            <w:r>
+              <w:rPr>
+                <w:rFonts w:ascii="Times New Roman" w:hAnsi="Times New Roman" w:cs="Times New Roman"/>
+                <w:color w:val="000000"/>
+                <w:sz w:val="24"/>
+                <w:szCs w:val="24"/>
+              </w:rPr>
+              <w:t xml:space="preserve"> Oktavia</w:t>
             </w:r>
           </w:p>
         </w:tc>
@@ -11659,14 +11996,25 @@
                 <w:szCs w:val="24"/>
               </w:rPr>
             </w:pPr>
-            <w:r>
-              <w:rPr>
-                <w:rFonts w:ascii="Times New Roman" w:hAnsi="Times New Roman" w:cs="Times New Roman"/>
-                <w:color w:val="000000"/>
-                <w:sz w:val="24"/>
-                <w:szCs w:val="24"/>
-              </w:rPr>
-              <w:t>Resaka Auliani</w:t>
+            <w:proofErr w:type="spellStart"/>
+            <w:r>
+              <w:rPr>
+                <w:rFonts w:ascii="Times New Roman" w:hAnsi="Times New Roman" w:cs="Times New Roman"/>
+                <w:color w:val="000000"/>
+                <w:sz w:val="24"/>
+                <w:szCs w:val="24"/>
+              </w:rPr>
+              <w:t>Resaka</w:t>
+            </w:r>
+            <w:proofErr w:type="spellEnd"/>
+            <w:r>
+              <w:rPr>
+                <w:rFonts w:ascii="Times New Roman" w:hAnsi="Times New Roman" w:cs="Times New Roman"/>
+                <w:color w:val="000000"/>
+                <w:sz w:val="24"/>
+                <w:szCs w:val="24"/>
+              </w:rPr>
+              <w:t xml:space="preserve"> Auliani</w:t>
             </w:r>
           </w:p>
         </w:tc>
@@ -11825,7 +12173,27 @@
                 <w:sz w:val="24"/>
                 <w:szCs w:val="24"/>
               </w:rPr>
-              <w:t>Aura Anaya Dewi</w:t>
+              <w:t xml:space="preserve">Aura </w:t>
+            </w:r>
+            <w:proofErr w:type="spellStart"/>
+            <w:r>
+              <w:rPr>
+                <w:rFonts w:ascii="Times New Roman" w:hAnsi="Times New Roman" w:cs="Times New Roman"/>
+                <w:color w:val="000000"/>
+                <w:sz w:val="24"/>
+                <w:szCs w:val="24"/>
+              </w:rPr>
+              <w:t>Anaya</w:t>
+            </w:r>
+            <w:proofErr w:type="spellEnd"/>
+            <w:r>
+              <w:rPr>
+                <w:rFonts w:ascii="Times New Roman" w:hAnsi="Times New Roman" w:cs="Times New Roman"/>
+                <w:color w:val="000000"/>
+                <w:sz w:val="24"/>
+                <w:szCs w:val="24"/>
+              </w:rPr>
+              <w:t xml:space="preserve"> Dewi</w:t>
             </w:r>
           </w:p>
         </w:tc>
@@ -12635,7 +13003,27 @@
                 <w:sz w:val="24"/>
                 <w:szCs w:val="24"/>
               </w:rPr>
-              <w:t xml:space="preserve">Salsa Bila Nur Alipah </w:t>
+              <w:t xml:space="preserve">Salsa Bila Nur </w:t>
+            </w:r>
+            <w:proofErr w:type="spellStart"/>
+            <w:r>
+              <w:rPr>
+                <w:rFonts w:ascii="Times New Roman" w:hAnsi="Times New Roman" w:cs="Times New Roman"/>
+                <w:color w:val="000000"/>
+                <w:sz w:val="24"/>
+                <w:szCs w:val="24"/>
+              </w:rPr>
+              <w:t>Alipah</w:t>
+            </w:r>
+            <w:proofErr w:type="spellEnd"/>
+            <w:r>
+              <w:rPr>
+                <w:rFonts w:ascii="Times New Roman" w:hAnsi="Times New Roman" w:cs="Times New Roman"/>
+                <w:color w:val="000000"/>
+                <w:sz w:val="24"/>
+                <w:szCs w:val="24"/>
+              </w:rPr>
+              <w:t xml:space="preserve"> </w:t>
             </w:r>
           </w:p>
         </w:tc>
@@ -12970,14 +13358,45 @@
                 <w:szCs w:val="24"/>
               </w:rPr>
             </w:pPr>
-            <w:r>
-              <w:rPr>
-                <w:rFonts w:ascii="Times New Roman" w:hAnsi="Times New Roman" w:cs="Times New Roman"/>
-                <w:color w:val="000000"/>
-                <w:sz w:val="24"/>
-                <w:szCs w:val="24"/>
-              </w:rPr>
-              <w:t xml:space="preserve">Nazhan Nasulloh </w:t>
+            <w:proofErr w:type="spellStart"/>
+            <w:r>
+              <w:rPr>
+                <w:rFonts w:ascii="Times New Roman" w:hAnsi="Times New Roman" w:cs="Times New Roman"/>
+                <w:color w:val="000000"/>
+                <w:sz w:val="24"/>
+                <w:szCs w:val="24"/>
+              </w:rPr>
+              <w:t>Nazhan</w:t>
+            </w:r>
+            <w:proofErr w:type="spellEnd"/>
+            <w:r>
+              <w:rPr>
+                <w:rFonts w:ascii="Times New Roman" w:hAnsi="Times New Roman" w:cs="Times New Roman"/>
+                <w:color w:val="000000"/>
+                <w:sz w:val="24"/>
+                <w:szCs w:val="24"/>
+              </w:rPr>
+              <w:t xml:space="preserve"> </w:t>
+            </w:r>
+            <w:proofErr w:type="spellStart"/>
+            <w:r>
+              <w:rPr>
+                <w:rFonts w:ascii="Times New Roman" w:hAnsi="Times New Roman" w:cs="Times New Roman"/>
+                <w:color w:val="000000"/>
+                <w:sz w:val="24"/>
+                <w:szCs w:val="24"/>
+              </w:rPr>
+              <w:t>Nasulloh</w:t>
+            </w:r>
+            <w:proofErr w:type="spellEnd"/>
+            <w:r>
+              <w:rPr>
+                <w:rFonts w:ascii="Times New Roman" w:hAnsi="Times New Roman" w:cs="Times New Roman"/>
+                <w:color w:val="000000"/>
+                <w:sz w:val="24"/>
+                <w:szCs w:val="24"/>
+              </w:rPr>
+              <w:t xml:space="preserve"> </w:t>
             </w:r>
           </w:p>
         </w:tc>
@@ -13136,7 +13555,27 @@
                 <w:sz w:val="24"/>
                 <w:szCs w:val="24"/>
               </w:rPr>
-              <w:t>Muhammad Nevan Alfath</w:t>
+              <w:t xml:space="preserve">Muhammad </w:t>
+            </w:r>
+            <w:proofErr w:type="spellStart"/>
+            <w:r>
+              <w:rPr>
+                <w:rFonts w:ascii="Times New Roman" w:hAnsi="Times New Roman" w:cs="Times New Roman"/>
+                <w:color w:val="000000"/>
+                <w:sz w:val="24"/>
+                <w:szCs w:val="24"/>
+              </w:rPr>
+              <w:t>Nevan</w:t>
+            </w:r>
+            <w:proofErr w:type="spellEnd"/>
+            <w:r>
+              <w:rPr>
+                <w:rFonts w:ascii="Times New Roman" w:hAnsi="Times New Roman" w:cs="Times New Roman"/>
+                <w:color w:val="000000"/>
+                <w:sz w:val="24"/>
+                <w:szCs w:val="24"/>
+              </w:rPr>
+              <w:t xml:space="preserve"> Alfath</w:t>
             </w:r>
           </w:p>
         </w:tc>
@@ -13494,7 +13933,27 @@
                 <w:sz w:val="24"/>
                 <w:szCs w:val="24"/>
               </w:rPr>
-              <w:t>Wafa Awwaliatunnisa R</w:t>
+              <w:t xml:space="preserve">Wafa </w:t>
+            </w:r>
+            <w:proofErr w:type="spellStart"/>
+            <w:r>
+              <w:rPr>
+                <w:rFonts w:ascii="Times New Roman" w:hAnsi="Times New Roman" w:cs="Times New Roman"/>
+                <w:color w:val="000000"/>
+                <w:sz w:val="24"/>
+                <w:szCs w:val="24"/>
+              </w:rPr>
+              <w:t>Awwaliatunnisa</w:t>
+            </w:r>
+            <w:proofErr w:type="spellEnd"/>
+            <w:r>
+              <w:rPr>
+                <w:rFonts w:ascii="Times New Roman" w:hAnsi="Times New Roman" w:cs="Times New Roman"/>
+                <w:color w:val="000000"/>
+                <w:sz w:val="24"/>
+                <w:szCs w:val="24"/>
+              </w:rPr>
+              <w:t xml:space="preserve"> R</w:t>
             </w:r>
           </w:p>
         </w:tc>
@@ -13646,14 +14105,25 @@
                 <w:szCs w:val="24"/>
               </w:rPr>
             </w:pPr>
-            <w:r>
-              <w:rPr>
-                <w:rFonts w:ascii="Times New Roman" w:hAnsi="Times New Roman" w:cs="Times New Roman"/>
-                <w:color w:val="000000"/>
-                <w:sz w:val="24"/>
-                <w:szCs w:val="24"/>
-              </w:rPr>
-              <w:t xml:space="preserve">Ferihana Mardina </w:t>
+            <w:proofErr w:type="spellStart"/>
+            <w:r>
+              <w:rPr>
+                <w:rFonts w:ascii="Times New Roman" w:hAnsi="Times New Roman" w:cs="Times New Roman"/>
+                <w:color w:val="000000"/>
+                <w:sz w:val="24"/>
+                <w:szCs w:val="24"/>
+              </w:rPr>
+              <w:t>Ferihana</w:t>
+            </w:r>
+            <w:proofErr w:type="spellEnd"/>
+            <w:r>
+              <w:rPr>
+                <w:rFonts w:ascii="Times New Roman" w:hAnsi="Times New Roman" w:cs="Times New Roman"/>
+                <w:color w:val="000000"/>
+                <w:sz w:val="24"/>
+                <w:szCs w:val="24"/>
+              </w:rPr>
+              <w:t xml:space="preserve"> Mardina </w:t>
             </w:r>
           </w:p>
         </w:tc>
@@ -13971,8 +14441,19 @@
                 <w:sz w:val="24"/>
                 <w:szCs w:val="24"/>
               </w:rPr>
-              <w:t>Deby Alinsky</w:t>
-            </w:r>
+              <w:t xml:space="preserve">Deby </w:t>
+            </w:r>
+            <w:proofErr w:type="spellStart"/>
+            <w:r>
+              <w:rPr>
+                <w:rFonts w:ascii="Times New Roman" w:hAnsi="Times New Roman" w:cs="Times New Roman"/>
+                <w:color w:val="000000"/>
+                <w:sz w:val="24"/>
+                <w:szCs w:val="24"/>
+              </w:rPr>
+              <w:t>Alinsky</w:t>
+            </w:r>
+            <w:proofErr w:type="spellEnd"/>
           </w:p>
         </w:tc>
         <w:tc>
@@ -14289,8 +14770,39 @@
                 <w:sz w:val="24"/>
                 <w:szCs w:val="24"/>
               </w:rPr>
-              <w:t>Rury January Risnawan</w:t>
-            </w:r>
+              <w:t xml:space="preserve">Rury </w:t>
+            </w:r>
+            <w:proofErr w:type="spellStart"/>
+            <w:r>
+              <w:rPr>
+                <w:rFonts w:ascii="Times New Roman" w:hAnsi="Times New Roman" w:cs="Times New Roman"/>
+                <w:color w:val="000000"/>
+                <w:sz w:val="24"/>
+                <w:szCs w:val="24"/>
+              </w:rPr>
+              <w:t>January</w:t>
+            </w:r>
+            <w:proofErr w:type="spellEnd"/>
+            <w:r>
+              <w:rPr>
+                <w:rFonts w:ascii="Times New Roman" w:hAnsi="Times New Roman" w:cs="Times New Roman"/>
+                <w:color w:val="000000"/>
+                <w:sz w:val="24"/>
+                <w:szCs w:val="24"/>
+              </w:rPr>
+              <w:t xml:space="preserve"> </w:t>
+            </w:r>
+            <w:proofErr w:type="spellStart"/>
+            <w:r>
+              <w:rPr>
+                <w:rFonts w:ascii="Times New Roman" w:hAnsi="Times New Roman" w:cs="Times New Roman"/>
+                <w:color w:val="000000"/>
+                <w:sz w:val="24"/>
+                <w:szCs w:val="24"/>
+              </w:rPr>
+              <w:t>Risnawan</w:t>
+            </w:r>
+            <w:proofErr w:type="spellEnd"/>
           </w:p>
         </w:tc>
         <w:tc>
@@ -14600,14 +15112,25 @@
                 <w:szCs w:val="24"/>
               </w:rPr>
             </w:pPr>
-            <w:r>
-              <w:rPr>
-                <w:rFonts w:ascii="Times New Roman" w:hAnsi="Times New Roman" w:cs="Times New Roman"/>
-                <w:color w:val="000000"/>
-                <w:sz w:val="24"/>
-                <w:szCs w:val="24"/>
-              </w:rPr>
-              <w:t>R.Muhammad Fajar Aqil Sugianto</w:t>
+            <w:proofErr w:type="spellStart"/>
+            <w:r>
+              <w:rPr>
+                <w:rFonts w:ascii="Times New Roman" w:hAnsi="Times New Roman" w:cs="Times New Roman"/>
+                <w:color w:val="000000"/>
+                <w:sz w:val="24"/>
+                <w:szCs w:val="24"/>
+              </w:rPr>
+              <w:t>R.Muhammad</w:t>
+            </w:r>
+            <w:proofErr w:type="spellEnd"/>
+            <w:r>
+              <w:rPr>
+                <w:rFonts w:ascii="Times New Roman" w:hAnsi="Times New Roman" w:cs="Times New Roman"/>
+                <w:color w:val="000000"/>
+                <w:sz w:val="24"/>
+                <w:szCs w:val="24"/>
+              </w:rPr>
+              <w:t xml:space="preserve"> Fajar Aqil Sugianto</w:t>
             </w:r>
           </w:p>
         </w:tc>
@@ -15101,7 +15624,27 @@
                 <w:sz w:val="24"/>
                 <w:szCs w:val="24"/>
               </w:rPr>
-              <w:t xml:space="preserve">Muhamad Meiky Ramdani </w:t>
+              <w:t xml:space="preserve">Muhamad </w:t>
+            </w:r>
+            <w:proofErr w:type="spellStart"/>
+            <w:r>
+              <w:rPr>
+                <w:rFonts w:ascii="Times New Roman" w:hAnsi="Times New Roman" w:cs="Times New Roman"/>
+                <w:color w:val="000000"/>
+                <w:sz w:val="24"/>
+                <w:szCs w:val="24"/>
+              </w:rPr>
+              <w:t>Meiky</w:t>
+            </w:r>
+            <w:proofErr w:type="spellEnd"/>
+            <w:r>
+              <w:rPr>
+                <w:rFonts w:ascii="Times New Roman" w:hAnsi="Times New Roman" w:cs="Times New Roman"/>
+                <w:color w:val="000000"/>
+                <w:sz w:val="24"/>
+                <w:szCs w:val="24"/>
+              </w:rPr>
+              <w:t xml:space="preserve"> Ramdani </w:t>
             </w:r>
           </w:p>
         </w:tc>
@@ -15776,6 +16319,66 @@
         </w:tc>
       </w:tr>
     </w:tbl>
+    <w:p>
+      <w:pPr>
+        <w:widowControl w:val="0"/>
+        <w:spacing w:before="189" w:after="0" w:line="240" w:lineRule="auto"/>
+        <w:rPr>
+          <w:rFonts w:ascii="Times New Roman" w:eastAsia="Times New Roman" w:hAnsi="Times New Roman" w:cs="Times New Roman"/>
+          <w:b/>
+          <w:sz w:val="24"/>
+          <w:szCs w:val="24"/>
+        </w:rPr>
+      </w:pPr>
+    </w:p>
+    <w:p>
+      <w:pPr>
+        <w:widowControl w:val="0"/>
+        <w:spacing w:before="189" w:after="0" w:line="240" w:lineRule="auto"/>
+        <w:rPr>
+          <w:rFonts w:ascii="Times New Roman" w:eastAsia="Times New Roman" w:hAnsi="Times New Roman" w:cs="Times New Roman"/>
+          <w:b/>
+          <w:sz w:val="24"/>
+          <w:szCs w:val="24"/>
+        </w:rPr>
+      </w:pPr>
+    </w:p>
+    <w:p>
+      <w:pPr>
+        <w:widowControl w:val="0"/>
+        <w:spacing w:before="189" w:after="0" w:line="240" w:lineRule="auto"/>
+        <w:rPr>
+          <w:rFonts w:ascii="Times New Roman" w:eastAsia="Times New Roman" w:hAnsi="Times New Roman" w:cs="Times New Roman"/>
+          <w:b/>
+          <w:sz w:val="24"/>
+          <w:szCs w:val="24"/>
+        </w:rPr>
+      </w:pPr>
+    </w:p>
+    <w:p>
+      <w:pPr>
+        <w:widowControl w:val="0"/>
+        <w:spacing w:before="189" w:after="0" w:line="240" w:lineRule="auto"/>
+        <w:rPr>
+          <w:rFonts w:ascii="Times New Roman" w:eastAsia="Times New Roman" w:hAnsi="Times New Roman" w:cs="Times New Roman"/>
+          <w:b/>
+          <w:sz w:val="24"/>
+          <w:szCs w:val="24"/>
+        </w:rPr>
+      </w:pPr>
+    </w:p>
+    <w:p>
+      <w:pPr>
+        <w:widowControl w:val="0"/>
+        <w:spacing w:before="189" w:after="0" w:line="240" w:lineRule="auto"/>
+        <w:rPr>
+          <w:rFonts w:ascii="Times New Roman" w:eastAsia="Times New Roman" w:hAnsi="Times New Roman" w:cs="Times New Roman"/>
+          <w:b/>
+          <w:sz w:val="24"/>
+          <w:szCs w:val="24"/>
+        </w:rPr>
+      </w:pPr>
+    </w:p>
     <w:p>
       <w:pPr>
         <w:widowControl w:val="0"/>
@@ -15882,7 +16485,23 @@
                 <w:sz w:val="24"/>
                 <w:szCs w:val="24"/>
               </w:rPr>
-              <w:t>Cianjur, September 2025</w:t>
+              <w:t xml:space="preserve">Cianjur, </w:t>
+            </w:r>
+            <w:r>
+              <w:rPr>
+                <w:rFonts w:ascii="Times New Roman" w:eastAsia="Times New Roman" w:hAnsi="Times New Roman" w:cs="Times New Roman"/>
+                <w:sz w:val="24"/>
+                <w:szCs w:val="24"/>
+              </w:rPr>
+              <w:t xml:space="preserve">25 Agustus </w:t>
+            </w:r>
+            <w:r>
+              <w:rPr>
+                <w:rFonts w:ascii="Times New Roman" w:eastAsia="Times New Roman" w:hAnsi="Times New Roman" w:cs="Times New Roman"/>
+                <w:sz w:val="24"/>
+                <w:szCs w:val="24"/>
+              </w:rPr>
+              <w:t>2025</w:t>
             </w:r>
           </w:p>
         </w:tc>
@@ -15967,6 +16586,7 @@
                 <w:szCs w:val="24"/>
               </w:rPr>
             </w:pPr>
+            <w:proofErr w:type="spellStart"/>
             <w:r>
               <w:rPr>
                 <w:rFonts w:ascii="Times New Roman" w:eastAsia="Times New Roman" w:hAnsi="Times New Roman" w:cs="Times New Roman"/>
@@ -15974,7 +16594,17 @@
                 <w:sz w:val="24"/>
                 <w:szCs w:val="24"/>
               </w:rPr>
-              <w:t>Wakasek Bidang Kesiswaan</w:t>
+              <w:t>Wakasek</w:t>
+            </w:r>
+            <w:proofErr w:type="spellEnd"/>
+            <w:r>
+              <w:rPr>
+                <w:rFonts w:ascii="Times New Roman" w:eastAsia="Times New Roman" w:hAnsi="Times New Roman" w:cs="Times New Roman"/>
+                <w:b/>
+                <w:sz w:val="24"/>
+                <w:szCs w:val="24"/>
+              </w:rPr>
+              <w:t xml:space="preserve"> Bidang Kesiswaan</w:t>
             </w:r>
           </w:p>
         </w:tc>
@@ -16238,8 +16868,20 @@
                 <w:szCs w:val="24"/>
                 <w:u w:val="single"/>
               </w:rPr>
-              <w:t>NINING IRMA AHDIANTI, S.Pd</w:t>
-            </w:r>
+              <w:t xml:space="preserve">NINING IRMA AHDIANTI, </w:t>
+            </w:r>
+            <w:proofErr w:type="spellStart"/>
+            <w:r>
+              <w:rPr>
+                <w:rFonts w:ascii="Times New Roman" w:eastAsia="Times New Roman" w:hAnsi="Times New Roman" w:cs="Times New Roman"/>
+                <w:b/>
+                <w:sz w:val="24"/>
+                <w:szCs w:val="24"/>
+                <w:u w:val="single"/>
+              </w:rPr>
+              <w:t>S.Pd</w:t>
+            </w:r>
+            <w:proofErr w:type="spellEnd"/>
           </w:p>
           <w:p>
             <w:pPr>
@@ -16660,8 +17302,20 @@
                 <w:szCs w:val="24"/>
                 <w:u w:val="single"/>
               </w:rPr>
-              <w:t>JAKARIA, S.Pd., M.Pd</w:t>
-            </w:r>
+              <w:t xml:space="preserve">JAKARIA, S.Pd., </w:t>
+            </w:r>
+            <w:proofErr w:type="spellStart"/>
+            <w:r>
+              <w:rPr>
+                <w:rFonts w:ascii="Times New Roman" w:eastAsia="Times New Roman" w:hAnsi="Times New Roman" w:cs="Times New Roman"/>
+                <w:b/>
+                <w:sz w:val="24"/>
+                <w:szCs w:val="24"/>
+                <w:u w:val="single"/>
+              </w:rPr>
+              <w:t>M.Pd</w:t>
+            </w:r>
+            <w:proofErr w:type="spellEnd"/>
           </w:p>
           <w:p>
             <w:pPr>
@@ -16838,7 +17492,7 @@
                     <pic:cNvPicPr preferRelativeResize="0"/>
                   </pic:nvPicPr>
                   <pic:blipFill>
-                    <a:blip r:embed="rId10"/>
+                    <a:blip r:embed="rId9"/>
                     <a:srcRect/>
                     <a:stretch>
                       <a:fillRect/>
@@ -16880,6 +17534,19 @@
         <w:rPr>
           <w:rFonts w:ascii="Times New Roman" w:eastAsia="Times New Roman" w:hAnsi="Times New Roman" w:cs="Times New Roman"/>
           <w:b/>
+          <w:noProof/>
+          <w:sz w:val="24"/>
+          <w:szCs w:val="24"/>
+        </w:rPr>
+      </w:pPr>
+    </w:p>
+    <w:p>
+      <w:pPr>
+        <w:spacing w:after="0" w:line="240" w:lineRule="auto"/>
+        <w:jc w:val="center"/>
+        <w:rPr>
+          <w:rFonts w:ascii="Times New Roman" w:eastAsia="Times New Roman" w:hAnsi="Times New Roman" w:cs="Times New Roman"/>
+          <w:b/>
           <w:sz w:val="24"/>
           <w:szCs w:val="24"/>
         </w:rPr>
@@ -16907,7 +17574,7 @@
                     <pic:cNvPicPr preferRelativeResize="0"/>
                   </pic:nvPicPr>
                   <pic:blipFill>
-                    <a:blip r:embed="rId11"/>
+                    <a:blip r:embed="rId10"/>
                     <a:srcRect/>
                     <a:stretch>
                       <a:fillRect/>
@@ -16975,7 +17642,7 @@
                     <pic:cNvPicPr preferRelativeResize="0"/>
                   </pic:nvPicPr>
                   <pic:blipFill>
-                    <a:blip r:embed="rId12"/>
+                    <a:blip r:embed="rId11"/>
                     <a:srcRect/>
                     <a:stretch>
                       <a:fillRect/>
@@ -17032,7 +17699,7 @@
                     <pic:cNvPicPr preferRelativeResize="0"/>
                   </pic:nvPicPr>
                   <pic:blipFill>
-                    <a:blip r:embed="rId13"/>
+                    <a:blip r:embed="rId12"/>
                     <a:srcRect/>
                     <a:stretch>
                       <a:fillRect/>
@@ -17100,7 +17767,7 @@
                     <pic:cNvPicPr preferRelativeResize="0"/>
                   </pic:nvPicPr>
                   <pic:blipFill>
-                    <a:blip r:embed="rId14"/>
+                    <a:blip r:embed="rId13"/>
                     <a:srcRect/>
                     <a:stretch>
                       <a:fillRect/>
@@ -17238,7 +17905,7 @@
                     <pic:cNvPicPr preferRelativeResize="0"/>
                   </pic:nvPicPr>
                   <pic:blipFill>
-                    <a:blip r:embed="rId15"/>
+                    <a:blip r:embed="rId14"/>
                     <a:srcRect/>
                     <a:stretch>
                       <a:fillRect/>
@@ -17292,7 +17959,7 @@
                     <pic:cNvPicPr preferRelativeResize="0"/>
                   </pic:nvPicPr>
                   <pic:blipFill>
-                    <a:blip r:embed="rId16"/>
+                    <a:blip r:embed="rId15"/>
                     <a:srcRect/>
                     <a:stretch>
                       <a:fillRect/>
@@ -17840,7 +18507,47 @@
         <w:sz w:val="24"/>
         <w:szCs w:val="24"/>
       </w:rPr>
-      <w:t>Jl. Pasir Santa Telp. (0263) 2934278 Ciranjang 43282</w:t>
+      <w:t xml:space="preserve">Jl. Pasir Santa </w:t>
+    </w:r>
+    <w:proofErr w:type="spellStart"/>
+    <w:r>
+      <w:rPr>
+        <w:rFonts w:ascii="Times New Roman" w:eastAsia="Times New Roman" w:hAnsi="Times New Roman" w:cs="Times New Roman"/>
+        <w:color w:val="000000"/>
+        <w:sz w:val="24"/>
+        <w:szCs w:val="24"/>
+      </w:rPr>
+      <w:t>Telp</w:t>
+    </w:r>
+    <w:proofErr w:type="spellEnd"/>
+    <w:r>
+      <w:rPr>
+        <w:rFonts w:ascii="Times New Roman" w:eastAsia="Times New Roman" w:hAnsi="Times New Roman" w:cs="Times New Roman"/>
+        <w:color w:val="000000"/>
+        <w:sz w:val="24"/>
+        <w:szCs w:val="24"/>
+      </w:rPr>
+      <w:t xml:space="preserve">. (0263) 2934278 </w:t>
+    </w:r>
+    <w:proofErr w:type="spellStart"/>
+    <w:r>
+      <w:rPr>
+        <w:rFonts w:ascii="Times New Roman" w:eastAsia="Times New Roman" w:hAnsi="Times New Roman" w:cs="Times New Roman"/>
+        <w:color w:val="000000"/>
+        <w:sz w:val="24"/>
+        <w:szCs w:val="24"/>
+      </w:rPr>
+      <w:t>Ciranjang</w:t>
+    </w:r>
+    <w:proofErr w:type="spellEnd"/>
+    <w:r>
+      <w:rPr>
+        <w:rFonts w:ascii="Times New Roman" w:eastAsia="Times New Roman" w:hAnsi="Times New Roman" w:cs="Times New Roman"/>
+        <w:color w:val="000000"/>
+        <w:sz w:val="24"/>
+        <w:szCs w:val="24"/>
+      </w:rPr>
+      <w:t xml:space="preserve"> 43282</w:t>
     </w:r>
   </w:p>
 </w:hdr>

</xml_diff>

<commit_message>
Nambahin ttd Pembina (Pak Indra) + Save to PDF)
</commit_message>
<xml_diff>
--- a/Laporan SKC Agustus 2025.docx
+++ b/Laporan SKC Agustus 2025.docx
@@ -94,39 +94,8 @@
           <w:szCs w:val="24"/>
         </w:rPr>
         <w:tab/>
-        <w:t xml:space="preserve">: </w:t>
+        <w:t>: Smancir Komputer Club</w:t>
       </w:r>
-      <w:proofErr w:type="spellStart"/>
-      <w:r>
-        <w:rPr>
-          <w:rFonts w:ascii="Times New Roman" w:eastAsia="Times New Roman" w:hAnsi="Times New Roman" w:cs="Times New Roman"/>
-          <w:b/>
-          <w:sz w:val="24"/>
-          <w:szCs w:val="24"/>
-        </w:rPr>
-        <w:t>Smancir</w:t>
-      </w:r>
-      <w:proofErr w:type="spellEnd"/>
-      <w:r>
-        <w:rPr>
-          <w:rFonts w:ascii="Times New Roman" w:eastAsia="Times New Roman" w:hAnsi="Times New Roman" w:cs="Times New Roman"/>
-          <w:b/>
-          <w:sz w:val="24"/>
-          <w:szCs w:val="24"/>
-        </w:rPr>
-        <w:t xml:space="preserve"> Komputer </w:t>
-      </w:r>
-      <w:proofErr w:type="spellStart"/>
-      <w:r>
-        <w:rPr>
-          <w:rFonts w:ascii="Times New Roman" w:eastAsia="Times New Roman" w:hAnsi="Times New Roman" w:cs="Times New Roman"/>
-          <w:b/>
-          <w:sz w:val="24"/>
-          <w:szCs w:val="24"/>
-        </w:rPr>
-        <w:t>Club</w:t>
-      </w:r>
-      <w:proofErr w:type="spellEnd"/>
     </w:p>
     <w:p>
       <w:pPr>
@@ -444,23 +413,13 @@
                 <w:szCs w:val="24"/>
               </w:rPr>
             </w:pPr>
-            <w:proofErr w:type="spellStart"/>
-            <w:r>
-              <w:rPr>
-                <w:rFonts w:ascii="Times New Roman" w:eastAsia="Times New Roman" w:hAnsi="Times New Roman" w:cs="Times New Roman"/>
-                <w:sz w:val="24"/>
-                <w:szCs w:val="24"/>
-              </w:rPr>
-              <w:t>Ttd</w:t>
-            </w:r>
-            <w:proofErr w:type="spellEnd"/>
-            <w:r>
-              <w:rPr>
-                <w:rFonts w:ascii="Times New Roman" w:eastAsia="Times New Roman" w:hAnsi="Times New Roman" w:cs="Times New Roman"/>
-                <w:sz w:val="24"/>
-                <w:szCs w:val="24"/>
-              </w:rPr>
-              <w:t xml:space="preserve"> Pembina/Pelatih</w:t>
+            <w:r>
+              <w:rPr>
+                <w:rFonts w:ascii="Times New Roman" w:eastAsia="Times New Roman" w:hAnsi="Times New Roman" w:cs="Times New Roman"/>
+                <w:sz w:val="24"/>
+                <w:szCs w:val="24"/>
+              </w:rPr>
+              <w:t>Ttd Pembina/Pelatih</w:t>
             </w:r>
           </w:p>
         </w:tc>
@@ -537,18 +496,8 @@
                 <w:sz w:val="24"/>
                 <w:szCs w:val="24"/>
               </w:rPr>
-              <w:t xml:space="preserve">SMAN 1 </w:t>
-            </w:r>
-            <w:proofErr w:type="spellStart"/>
-            <w:r>
-              <w:rPr>
-                <w:rFonts w:ascii="Times New Roman" w:eastAsia="Times New Roman" w:hAnsi="Times New Roman" w:cs="Times New Roman"/>
-                <w:sz w:val="24"/>
-                <w:szCs w:val="24"/>
-              </w:rPr>
-              <w:t>Ciranjang</w:t>
-            </w:r>
-            <w:proofErr w:type="spellEnd"/>
+              <w:t>SMAN 1 Ciranjang</w:t>
+            </w:r>
           </w:p>
         </w:tc>
         <w:tc>
@@ -571,43 +520,7 @@
                 <w:sz w:val="24"/>
                 <w:szCs w:val="24"/>
               </w:rPr>
-              <w:t xml:space="preserve">Perkenalan dan Pengantar </w:t>
-            </w:r>
-            <w:proofErr w:type="spellStart"/>
-            <w:r>
-              <w:rPr>
-                <w:rFonts w:ascii="Times New Roman" w:eastAsia="Times New Roman" w:hAnsi="Times New Roman" w:cs="Times New Roman"/>
-                <w:sz w:val="24"/>
-                <w:szCs w:val="24"/>
-              </w:rPr>
-              <w:t>Mikrokontroler</w:t>
-            </w:r>
-            <w:proofErr w:type="spellEnd"/>
-            <w:r>
-              <w:rPr>
-                <w:rFonts w:ascii="Times New Roman" w:eastAsia="Times New Roman" w:hAnsi="Times New Roman" w:cs="Times New Roman"/>
-                <w:sz w:val="24"/>
-                <w:szCs w:val="24"/>
-              </w:rPr>
-              <w:t xml:space="preserve"> (</w:t>
-            </w:r>
-            <w:proofErr w:type="spellStart"/>
-            <w:r>
-              <w:rPr>
-                <w:rFonts w:ascii="Times New Roman" w:eastAsia="Times New Roman" w:hAnsi="Times New Roman" w:cs="Times New Roman"/>
-                <w:sz w:val="24"/>
-                <w:szCs w:val="24"/>
-              </w:rPr>
-              <w:t>Arduino</w:t>
-            </w:r>
-            <w:proofErr w:type="spellEnd"/>
-            <w:r>
-              <w:rPr>
-                <w:rFonts w:ascii="Times New Roman" w:eastAsia="Times New Roman" w:hAnsi="Times New Roman" w:cs="Times New Roman"/>
-                <w:sz w:val="24"/>
-                <w:szCs w:val="24"/>
-              </w:rPr>
-              <w:t>, ESP32, &amp; STM32)</w:t>
+              <w:t>Perkenalan dan Pengantar Mikrokontroler (Arduino, ESP32, &amp; STM32)</w:t>
             </w:r>
           </w:p>
         </w:tc>
@@ -631,43 +544,7 @@
                 <w:sz w:val="24"/>
                 <w:szCs w:val="24"/>
               </w:rPr>
-              <w:t xml:space="preserve">Materi yang diajarkan mengenai pengenalan </w:t>
-            </w:r>
-            <w:proofErr w:type="spellStart"/>
-            <w:r>
-              <w:rPr>
-                <w:rFonts w:ascii="Times New Roman" w:eastAsia="Times New Roman" w:hAnsi="Times New Roman" w:cs="Times New Roman"/>
-                <w:sz w:val="24"/>
-                <w:szCs w:val="24"/>
-              </w:rPr>
-              <w:t>Mikrokontroler</w:t>
-            </w:r>
-            <w:proofErr w:type="spellEnd"/>
-            <w:r>
-              <w:rPr>
-                <w:rFonts w:ascii="Times New Roman" w:eastAsia="Times New Roman" w:hAnsi="Times New Roman" w:cs="Times New Roman"/>
-                <w:sz w:val="24"/>
-                <w:szCs w:val="24"/>
-              </w:rPr>
-              <w:t xml:space="preserve"> khususnya </w:t>
-            </w:r>
-            <w:proofErr w:type="spellStart"/>
-            <w:r>
-              <w:rPr>
-                <w:rFonts w:ascii="Times New Roman" w:eastAsia="Times New Roman" w:hAnsi="Times New Roman" w:cs="Times New Roman"/>
-                <w:sz w:val="24"/>
-                <w:szCs w:val="24"/>
-              </w:rPr>
-              <w:t>Arduino</w:t>
-            </w:r>
-            <w:proofErr w:type="spellEnd"/>
-            <w:r>
-              <w:rPr>
-                <w:rFonts w:ascii="Times New Roman" w:eastAsia="Times New Roman" w:hAnsi="Times New Roman" w:cs="Times New Roman"/>
-                <w:sz w:val="24"/>
-                <w:szCs w:val="24"/>
-              </w:rPr>
-              <w:t xml:space="preserve"> Uno dan penggunaannya dalam kehidupan sehari-hari. Materi disampaikan lewat Presentasi, Ceramah, Diskusi, dan Tanya jawab. Platform yang digunakan untuk belajar yaitu WOKWI Simulator</w:t>
+              <w:t>Materi yang diajarkan mengenai pengenalan Mikrokontroler khususnya Arduino Uno dan penggunaannya dalam kehidupan sehari-hari. Materi disampaikan lewat Presentasi, Ceramah, Diskusi, dan Tanya jawab. Platform yang digunakan untuk belajar yaitu WOKWI Simulator</w:t>
             </w:r>
           </w:p>
         </w:tc>
@@ -758,18 +635,8 @@
                 <w:sz w:val="24"/>
                 <w:szCs w:val="24"/>
               </w:rPr>
-              <w:t xml:space="preserve">SMAN 1 </w:t>
-            </w:r>
-            <w:proofErr w:type="spellStart"/>
-            <w:r>
-              <w:rPr>
-                <w:rFonts w:ascii="Times New Roman" w:eastAsia="Times New Roman" w:hAnsi="Times New Roman" w:cs="Times New Roman"/>
-                <w:sz w:val="24"/>
-                <w:szCs w:val="24"/>
-              </w:rPr>
-              <w:t>Ciranjang</w:t>
-            </w:r>
-            <w:proofErr w:type="spellEnd"/>
+              <w:t>SMAN 1 Ciranjang</w:t>
+            </w:r>
           </w:p>
         </w:tc>
         <w:tc>
@@ -826,25 +693,7 @@
                 <w:szCs w:val="24"/>
               </w:rPr>
               <w:lastRenderedPageBreak/>
-              <w:t xml:space="preserve">Komputer seperti monitor, </w:t>
-            </w:r>
-            <w:proofErr w:type="spellStart"/>
-            <w:r>
-              <w:rPr>
-                <w:rFonts w:ascii="Times New Roman" w:eastAsia="Times New Roman" w:hAnsi="Times New Roman" w:cs="Times New Roman"/>
-                <w:sz w:val="24"/>
-                <w:szCs w:val="24"/>
-              </w:rPr>
-              <w:t>keyboard</w:t>
-            </w:r>
-            <w:proofErr w:type="spellEnd"/>
-            <w:r>
-              <w:rPr>
-                <w:rFonts w:ascii="Times New Roman" w:eastAsia="Times New Roman" w:hAnsi="Times New Roman" w:cs="Times New Roman"/>
-                <w:sz w:val="24"/>
-                <w:szCs w:val="24"/>
-              </w:rPr>
-              <w:t>, dan mouse. Dan beberapa pengenalan Aplikasi yang sering digunakan dalam komputer untuk menunjang kebutuhan sehari-hari</w:t>
+              <w:t>Komputer seperti monitor, keyboard, dan mouse. Dan beberapa pengenalan Aplikasi yang sering digunakan dalam komputer untuk menunjang kebutuhan sehari-hari</w:t>
             </w:r>
           </w:p>
         </w:tc>
@@ -951,18 +800,8 @@
                 <w:sz w:val="24"/>
                 <w:szCs w:val="24"/>
               </w:rPr>
-              <w:t xml:space="preserve">SMAN 1 </w:t>
-            </w:r>
-            <w:proofErr w:type="spellStart"/>
-            <w:r>
-              <w:rPr>
-                <w:rFonts w:ascii="Times New Roman" w:eastAsia="Times New Roman" w:hAnsi="Times New Roman" w:cs="Times New Roman"/>
-                <w:sz w:val="24"/>
-                <w:szCs w:val="24"/>
-              </w:rPr>
-              <w:t>Ciranjang</w:t>
-            </w:r>
-            <w:proofErr w:type="spellEnd"/>
+              <w:t>SMAN 1 Ciranjang</w:t>
+            </w:r>
           </w:p>
         </w:tc>
         <w:tc>
@@ -987,7 +826,6 @@
               </w:rPr>
               <w:t xml:space="preserve">Pengenalan Lebih lanjut terkait Hardware Komputer dan </w:t>
             </w:r>
-            <w:proofErr w:type="spellStart"/>
             <w:r>
               <w:rPr>
                 <w:rFonts w:ascii="Times New Roman" w:eastAsia="Times New Roman" w:hAnsi="Times New Roman" w:cs="Times New Roman"/>
@@ -996,7 +834,6 @@
               </w:rPr>
               <w:t>Troubleshooting</w:t>
             </w:r>
-            <w:proofErr w:type="spellEnd"/>
           </w:p>
         </w:tc>
         <w:tc>
@@ -1019,25 +856,7 @@
                 <w:sz w:val="24"/>
                 <w:szCs w:val="24"/>
               </w:rPr>
-              <w:t xml:space="preserve">Materi yang diajarkan mengenai Hardware komputer/Perangkat Keras komputer dan cara memperbaikinya apabila terjadi </w:t>
-            </w:r>
-            <w:proofErr w:type="spellStart"/>
-            <w:r>
-              <w:rPr>
-                <w:rFonts w:ascii="Times New Roman" w:eastAsia="Times New Roman" w:hAnsi="Times New Roman" w:cs="Times New Roman"/>
-                <w:sz w:val="24"/>
-                <w:szCs w:val="24"/>
-              </w:rPr>
-              <w:t>malfungsi</w:t>
-            </w:r>
-            <w:proofErr w:type="spellEnd"/>
-            <w:r>
-              <w:rPr>
-                <w:rFonts w:ascii="Times New Roman" w:eastAsia="Times New Roman" w:hAnsi="Times New Roman" w:cs="Times New Roman"/>
-                <w:sz w:val="24"/>
-                <w:szCs w:val="24"/>
-              </w:rPr>
-              <w:t>. Materi diajarkan via ceramah, diskusi, praktik langsung, dan tanya jawab.</w:t>
+              <w:t>Materi yang diajarkan mengenai Hardware komputer/Perangkat Keras komputer dan cara memperbaikinya apabila terjadi malfungsi. Materi diajarkan via ceramah, diskusi, praktik langsung, dan tanya jawab.</w:t>
             </w:r>
           </w:p>
         </w:tc>
@@ -1128,18 +947,8 @@
                 <w:sz w:val="24"/>
                 <w:szCs w:val="24"/>
               </w:rPr>
-              <w:t xml:space="preserve">SMAN 1 </w:t>
-            </w:r>
-            <w:proofErr w:type="spellStart"/>
-            <w:r>
-              <w:rPr>
-                <w:rFonts w:ascii="Times New Roman" w:eastAsia="Times New Roman" w:hAnsi="Times New Roman" w:cs="Times New Roman"/>
-                <w:sz w:val="24"/>
-                <w:szCs w:val="24"/>
-              </w:rPr>
-              <w:t>Ciranjang</w:t>
-            </w:r>
-            <w:proofErr w:type="spellEnd"/>
+              <w:t>SMAN 1 Ciranjang</w:t>
+            </w:r>
           </w:p>
         </w:tc>
         <w:tc>
@@ -1277,25 +1086,7 @@
                 <w:sz w:val="24"/>
                 <w:szCs w:val="24"/>
               </w:rPr>
-              <w:t xml:space="preserve">SMAN 1 </w:t>
-            </w:r>
-            <w:proofErr w:type="spellStart"/>
-            <w:r>
-              <w:rPr>
-                <w:rFonts w:ascii="Times New Roman" w:eastAsia="Times New Roman" w:hAnsi="Times New Roman" w:cs="Times New Roman"/>
-                <w:sz w:val="24"/>
-                <w:szCs w:val="24"/>
-              </w:rPr>
-              <w:t>Ciranjang</w:t>
-            </w:r>
-            <w:proofErr w:type="spellEnd"/>
-            <w:r>
-              <w:rPr>
-                <w:rFonts w:ascii="Times New Roman" w:eastAsia="Times New Roman" w:hAnsi="Times New Roman" w:cs="Times New Roman"/>
-                <w:sz w:val="24"/>
-                <w:szCs w:val="24"/>
-              </w:rPr>
-              <w:t xml:space="preserve"> </w:t>
+              <w:t xml:space="preserve">SMAN 1 Ciranjang </w:t>
             </w:r>
           </w:p>
         </w:tc>
@@ -1352,61 +1143,7 @@
                 <w:szCs w:val="24"/>
               </w:rPr>
               <w:lastRenderedPageBreak/>
-              <w:t>sebuah diagram/</w:t>
-            </w:r>
-            <w:proofErr w:type="spellStart"/>
-            <w:r>
-              <w:rPr>
-                <w:rFonts w:ascii="Times New Roman" w:eastAsia="Times New Roman" w:hAnsi="Times New Roman" w:cs="Times New Roman"/>
-                <w:sz w:val="24"/>
-                <w:szCs w:val="24"/>
-              </w:rPr>
-              <w:t>chart</w:t>
-            </w:r>
-            <w:proofErr w:type="spellEnd"/>
-            <w:r>
-              <w:rPr>
-                <w:rFonts w:ascii="Times New Roman" w:eastAsia="Times New Roman" w:hAnsi="Times New Roman" w:cs="Times New Roman"/>
-                <w:sz w:val="24"/>
-                <w:szCs w:val="24"/>
-              </w:rPr>
-              <w:t xml:space="preserve"> di </w:t>
-            </w:r>
-            <w:proofErr w:type="spellStart"/>
-            <w:r>
-              <w:rPr>
-                <w:rFonts w:ascii="Times New Roman" w:eastAsia="Times New Roman" w:hAnsi="Times New Roman" w:cs="Times New Roman"/>
-                <w:sz w:val="24"/>
-                <w:szCs w:val="24"/>
-              </w:rPr>
-              <w:t>word</w:t>
-            </w:r>
-            <w:proofErr w:type="spellEnd"/>
-            <w:r>
-              <w:rPr>
-                <w:rFonts w:ascii="Times New Roman" w:eastAsia="Times New Roman" w:hAnsi="Times New Roman" w:cs="Times New Roman"/>
-                <w:sz w:val="24"/>
-                <w:szCs w:val="24"/>
-              </w:rPr>
-              <w:t xml:space="preserve">, lalu membuat tulisan menarik di </w:t>
-            </w:r>
-            <w:proofErr w:type="spellStart"/>
-            <w:r>
-              <w:rPr>
-                <w:rFonts w:ascii="Times New Roman" w:eastAsia="Times New Roman" w:hAnsi="Times New Roman" w:cs="Times New Roman"/>
-                <w:sz w:val="24"/>
-                <w:szCs w:val="24"/>
-              </w:rPr>
-              <w:t>WordArt</w:t>
-            </w:r>
-            <w:proofErr w:type="spellEnd"/>
-            <w:r>
-              <w:rPr>
-                <w:rFonts w:ascii="Times New Roman" w:eastAsia="Times New Roman" w:hAnsi="Times New Roman" w:cs="Times New Roman"/>
-                <w:sz w:val="24"/>
-                <w:szCs w:val="24"/>
-              </w:rPr>
-              <w:t>, dan lain-lain. Dasar-dasar Ms. Excel belajar cara mengolah data baik berupa angka maupun huruf. Materi yang diajarkan via Ceramah, Diskusi, Tanya jawab, dan praktik langsung di komputer.</w:t>
+              <w:t>sebuah diagram/chart di word, lalu membuat tulisan menarik di WordArt, dan lain-lain. Dasar-dasar Ms. Excel belajar cara mengolah data baik berupa angka maupun huruf. Materi yang diajarkan via Ceramah, Diskusi, Tanya jawab, dan praktik langsung di komputer.</w:t>
             </w:r>
           </w:p>
         </w:tc>
@@ -2026,7 +1763,6 @@
                 <w:szCs w:val="24"/>
               </w:rPr>
             </w:pPr>
-            <w:proofErr w:type="spellStart"/>
             <w:r>
               <w:rPr>
                 <w:rFonts w:ascii="Times New Roman" w:hAnsi="Times New Roman" w:cs="Times New Roman"/>
@@ -2036,7 +1772,6 @@
               </w:rPr>
               <w:t>Safiraturahmah</w:t>
             </w:r>
-            <w:proofErr w:type="spellEnd"/>
           </w:p>
         </w:tc>
         <w:tc>
@@ -3884,19 +3619,8 @@
                 <w:sz w:val="24"/>
                 <w:szCs w:val="24"/>
               </w:rPr>
-              <w:t xml:space="preserve">Alika </w:t>
-            </w:r>
-            <w:proofErr w:type="spellStart"/>
-            <w:r>
-              <w:rPr>
-                <w:rFonts w:ascii="Times New Roman" w:hAnsi="Times New Roman" w:cs="Times New Roman"/>
-                <w:color w:val="000000"/>
-                <w:sz w:val="24"/>
-                <w:szCs w:val="24"/>
-              </w:rPr>
-              <w:t>Kanzhania</w:t>
-            </w:r>
-            <w:proofErr w:type="spellEnd"/>
+              <w:t>Alika Kanzhania</w:t>
+            </w:r>
           </w:p>
         </w:tc>
         <w:tc>
@@ -4058,27 +3782,7 @@
                 <w:sz w:val="24"/>
                 <w:szCs w:val="24"/>
               </w:rPr>
-              <w:t xml:space="preserve">Dariel </w:t>
-            </w:r>
-            <w:proofErr w:type="spellStart"/>
-            <w:r>
-              <w:rPr>
-                <w:rFonts w:ascii="Times New Roman" w:hAnsi="Times New Roman" w:cs="Times New Roman"/>
-                <w:color w:val="000000"/>
-                <w:sz w:val="24"/>
-                <w:szCs w:val="24"/>
-              </w:rPr>
-              <w:t>Tifatul</w:t>
-            </w:r>
-            <w:proofErr w:type="spellEnd"/>
-            <w:r>
-              <w:rPr>
-                <w:rFonts w:ascii="Times New Roman" w:hAnsi="Times New Roman" w:cs="Times New Roman"/>
-                <w:color w:val="000000"/>
-                <w:sz w:val="24"/>
-                <w:szCs w:val="24"/>
-              </w:rPr>
-              <w:t xml:space="preserve"> Aprilio</w:t>
+              <w:t>Dariel Tifatul Aprilio</w:t>
             </w:r>
           </w:p>
         </w:tc>
@@ -4928,7 +4632,6 @@
                 <w:szCs w:val="24"/>
               </w:rPr>
             </w:pPr>
-            <w:proofErr w:type="spellStart"/>
             <w:r>
               <w:rPr>
                 <w:rFonts w:ascii="Times New Roman" w:hAnsi="Times New Roman" w:cs="Times New Roman"/>
@@ -4936,37 +4639,7 @@
                 <w:sz w:val="24"/>
                 <w:szCs w:val="24"/>
               </w:rPr>
-              <w:t>Heden</w:t>
-            </w:r>
-            <w:proofErr w:type="spellEnd"/>
-            <w:r>
-              <w:rPr>
-                <w:rFonts w:ascii="Times New Roman" w:hAnsi="Times New Roman" w:cs="Times New Roman"/>
-                <w:color w:val="000000"/>
-                <w:sz w:val="24"/>
-                <w:szCs w:val="24"/>
-              </w:rPr>
-              <w:t xml:space="preserve"> </w:t>
-            </w:r>
-            <w:proofErr w:type="spellStart"/>
-            <w:r>
-              <w:rPr>
-                <w:rFonts w:ascii="Times New Roman" w:hAnsi="Times New Roman" w:cs="Times New Roman"/>
-                <w:color w:val="000000"/>
-                <w:sz w:val="24"/>
-                <w:szCs w:val="24"/>
-              </w:rPr>
-              <w:t>Zena</w:t>
-            </w:r>
-            <w:proofErr w:type="spellEnd"/>
-            <w:r>
-              <w:rPr>
-                <w:rFonts w:ascii="Times New Roman" w:hAnsi="Times New Roman" w:cs="Times New Roman"/>
-                <w:color w:val="000000"/>
-                <w:sz w:val="24"/>
-                <w:szCs w:val="24"/>
-              </w:rPr>
-              <w:t xml:space="preserve"> Rafli</w:t>
+              <w:t>Heden Zena Rafli</w:t>
             </w:r>
           </w:p>
         </w:tc>
@@ -5308,39 +4981,8 @@
                 <w:sz w:val="24"/>
                 <w:szCs w:val="24"/>
               </w:rPr>
-              <w:t xml:space="preserve">Siti </w:t>
-            </w:r>
-            <w:proofErr w:type="spellStart"/>
-            <w:r>
-              <w:rPr>
-                <w:rFonts w:ascii="Times New Roman" w:hAnsi="Times New Roman" w:cs="Times New Roman"/>
-                <w:color w:val="000000"/>
-                <w:sz w:val="24"/>
-                <w:szCs w:val="24"/>
-              </w:rPr>
-              <w:t>Sayla</w:t>
-            </w:r>
-            <w:proofErr w:type="spellEnd"/>
-            <w:r>
-              <w:rPr>
-                <w:rFonts w:ascii="Times New Roman" w:hAnsi="Times New Roman" w:cs="Times New Roman"/>
-                <w:color w:val="000000"/>
-                <w:sz w:val="24"/>
-                <w:szCs w:val="24"/>
-              </w:rPr>
-              <w:t xml:space="preserve"> </w:t>
-            </w:r>
-            <w:proofErr w:type="spellStart"/>
-            <w:r>
-              <w:rPr>
-                <w:rFonts w:ascii="Times New Roman" w:hAnsi="Times New Roman" w:cs="Times New Roman"/>
-                <w:color w:val="000000"/>
-                <w:sz w:val="24"/>
-                <w:szCs w:val="24"/>
-              </w:rPr>
-              <w:t>Zulfahira</w:t>
-            </w:r>
-            <w:proofErr w:type="spellEnd"/>
+              <w:t>Siti Sayla Zulfahira</w:t>
+            </w:r>
           </w:p>
         </w:tc>
         <w:tc>
@@ -5487,7 +5129,6 @@
                 <w:szCs w:val="24"/>
               </w:rPr>
             </w:pPr>
-            <w:proofErr w:type="spellStart"/>
             <w:r>
               <w:rPr>
                 <w:rFonts w:ascii="Times New Roman" w:hAnsi="Times New Roman" w:cs="Times New Roman"/>
@@ -5495,17 +5136,7 @@
                 <w:sz w:val="24"/>
                 <w:szCs w:val="24"/>
               </w:rPr>
-              <w:t>Kanaya</w:t>
-            </w:r>
-            <w:proofErr w:type="spellEnd"/>
-            <w:r>
-              <w:rPr>
-                <w:rFonts w:ascii="Times New Roman" w:hAnsi="Times New Roman" w:cs="Times New Roman"/>
-                <w:color w:val="000000"/>
-                <w:sz w:val="24"/>
-                <w:szCs w:val="24"/>
-              </w:rPr>
-              <w:t xml:space="preserve"> Siti</w:t>
+              <w:t>Kanaya Siti</w:t>
             </w:r>
           </w:p>
         </w:tc>
@@ -5692,39 +5323,8 @@
                 <w:sz w:val="24"/>
                 <w:szCs w:val="24"/>
               </w:rPr>
-              <w:t xml:space="preserve">M </w:t>
-            </w:r>
-            <w:proofErr w:type="spellStart"/>
-            <w:r>
-              <w:rPr>
-                <w:rFonts w:ascii="Times New Roman" w:hAnsi="Times New Roman" w:cs="Times New Roman"/>
-                <w:color w:val="000000"/>
-                <w:sz w:val="24"/>
-                <w:szCs w:val="24"/>
-              </w:rPr>
-              <w:t>Binekas</w:t>
-            </w:r>
-            <w:proofErr w:type="spellEnd"/>
-            <w:r>
-              <w:rPr>
-                <w:rFonts w:ascii="Times New Roman" w:hAnsi="Times New Roman" w:cs="Times New Roman"/>
-                <w:color w:val="000000"/>
-                <w:sz w:val="24"/>
-                <w:szCs w:val="24"/>
-              </w:rPr>
-              <w:t xml:space="preserve"> </w:t>
-            </w:r>
-            <w:proofErr w:type="spellStart"/>
-            <w:r>
-              <w:rPr>
-                <w:rFonts w:ascii="Times New Roman" w:hAnsi="Times New Roman" w:cs="Times New Roman"/>
-                <w:color w:val="000000"/>
-                <w:sz w:val="24"/>
-                <w:szCs w:val="24"/>
-              </w:rPr>
-              <w:t>Prayata</w:t>
-            </w:r>
-            <w:proofErr w:type="spellEnd"/>
+              <w:t>M Binekas Prayata</w:t>
+            </w:r>
           </w:p>
         </w:tc>
         <w:tc>
@@ -5904,19 +5504,8 @@
                 <w:szCs w:val="24"/>
               </w:rPr>
               <w:lastRenderedPageBreak/>
-              <w:t xml:space="preserve">Muhammad Alwi </w:t>
-            </w:r>
-            <w:proofErr w:type="spellStart"/>
-            <w:r>
-              <w:rPr>
-                <w:rFonts w:ascii="Times New Roman" w:hAnsi="Times New Roman" w:cs="Times New Roman"/>
-                <w:color w:val="000000"/>
-                <w:sz w:val="24"/>
-                <w:szCs w:val="24"/>
-              </w:rPr>
-              <w:t>Attijani</w:t>
-            </w:r>
-            <w:proofErr w:type="spellEnd"/>
+              <w:t>Muhammad Alwi Attijani</w:t>
+            </w:r>
           </w:p>
         </w:tc>
         <w:tc>
@@ -6070,19 +5659,8 @@
                 <w:sz w:val="24"/>
                 <w:szCs w:val="24"/>
               </w:rPr>
-              <w:t xml:space="preserve">Abdurrahman </w:t>
-            </w:r>
-            <w:proofErr w:type="spellStart"/>
-            <w:r>
-              <w:rPr>
-                <w:rFonts w:ascii="Times New Roman" w:hAnsi="Times New Roman" w:cs="Times New Roman"/>
-                <w:color w:val="000000"/>
-                <w:sz w:val="24"/>
-                <w:szCs w:val="24"/>
-              </w:rPr>
-              <w:t>Mumtaz</w:t>
-            </w:r>
-            <w:proofErr w:type="spellEnd"/>
+              <w:t>Abdurrahman Mumtaz</w:t>
+            </w:r>
           </w:p>
         </w:tc>
         <w:tc>
@@ -6750,7 +6328,6 @@
                 <w:szCs w:val="24"/>
               </w:rPr>
             </w:pPr>
-            <w:proofErr w:type="spellStart"/>
             <w:r>
               <w:rPr>
                 <w:rFonts w:ascii="Times New Roman" w:hAnsi="Times New Roman" w:cs="Times New Roman"/>
@@ -6758,17 +6335,7 @@
                 <w:sz w:val="24"/>
                 <w:szCs w:val="24"/>
               </w:rPr>
-              <w:t>Keyza</w:t>
-            </w:r>
-            <w:proofErr w:type="spellEnd"/>
-            <w:r>
-              <w:rPr>
-                <w:rFonts w:ascii="Times New Roman" w:hAnsi="Times New Roman" w:cs="Times New Roman"/>
-                <w:color w:val="000000"/>
-                <w:sz w:val="24"/>
-                <w:szCs w:val="24"/>
-              </w:rPr>
-              <w:t xml:space="preserve"> Cinta Putri Malia</w:t>
+              <w:t>Keyza Cinta Putri Malia</w:t>
             </w:r>
           </w:p>
         </w:tc>
@@ -6947,19 +6514,8 @@
                 <w:sz w:val="24"/>
                 <w:szCs w:val="24"/>
               </w:rPr>
-              <w:t xml:space="preserve">Dede </w:t>
-            </w:r>
-            <w:proofErr w:type="spellStart"/>
-            <w:r>
-              <w:rPr>
-                <w:rFonts w:ascii="Times New Roman" w:hAnsi="Times New Roman" w:cs="Times New Roman"/>
-                <w:color w:val="000000"/>
-                <w:sz w:val="24"/>
-                <w:szCs w:val="24"/>
-              </w:rPr>
-              <w:t>Siham</w:t>
-            </w:r>
-            <w:proofErr w:type="spellEnd"/>
+              <w:t>Dede Siham</w:t>
+            </w:r>
           </w:p>
         </w:tc>
         <w:tc>
@@ -7448,19 +7004,8 @@
                 <w:sz w:val="24"/>
                 <w:szCs w:val="24"/>
               </w:rPr>
-              <w:t xml:space="preserve">Fajrin </w:t>
-            </w:r>
-            <w:proofErr w:type="spellStart"/>
-            <w:r>
-              <w:rPr>
-                <w:rFonts w:ascii="Times New Roman" w:hAnsi="Times New Roman" w:cs="Times New Roman"/>
-                <w:color w:val="000000"/>
-                <w:sz w:val="24"/>
-                <w:szCs w:val="24"/>
-              </w:rPr>
-              <w:t>Isnainfacshyadz</w:t>
-            </w:r>
-            <w:proofErr w:type="spellEnd"/>
+              <w:t>Fajrin Isnainfacshyadz</w:t>
+            </w:r>
           </w:p>
         </w:tc>
         <w:tc>
@@ -7804,27 +7349,7 @@
                 <w:sz w:val="24"/>
                 <w:szCs w:val="24"/>
               </w:rPr>
-              <w:t xml:space="preserve">M. </w:t>
-            </w:r>
-            <w:proofErr w:type="spellStart"/>
-            <w:r>
-              <w:rPr>
-                <w:rFonts w:ascii="Times New Roman" w:hAnsi="Times New Roman" w:cs="Times New Roman"/>
-                <w:color w:val="000000"/>
-                <w:sz w:val="24"/>
-                <w:szCs w:val="24"/>
-              </w:rPr>
-              <w:t>Nazril</w:t>
-            </w:r>
-            <w:proofErr w:type="spellEnd"/>
-            <w:r>
-              <w:rPr>
-                <w:rFonts w:ascii="Times New Roman" w:hAnsi="Times New Roman" w:cs="Times New Roman"/>
-                <w:color w:val="000000"/>
-                <w:sz w:val="24"/>
-                <w:szCs w:val="24"/>
-              </w:rPr>
-              <w:t xml:space="preserve"> Al Munawir</w:t>
+              <w:t>M. Nazril Al Munawir</w:t>
             </w:r>
           </w:p>
         </w:tc>
@@ -8174,19 +7699,8 @@
                 <w:sz w:val="24"/>
                 <w:szCs w:val="24"/>
               </w:rPr>
-              <w:t xml:space="preserve">Hana </w:t>
-            </w:r>
-            <w:proofErr w:type="spellStart"/>
-            <w:r>
-              <w:rPr>
-                <w:rFonts w:ascii="Times New Roman" w:hAnsi="Times New Roman" w:cs="Times New Roman"/>
-                <w:color w:val="000000"/>
-                <w:sz w:val="24"/>
-                <w:szCs w:val="24"/>
-              </w:rPr>
-              <w:t>Ferlyani</w:t>
-            </w:r>
-            <w:proofErr w:type="spellEnd"/>
+              <w:t>Hana Ferlyani</w:t>
+            </w:r>
           </w:p>
         </w:tc>
         <w:tc>
@@ -9366,19 +8880,8 @@
                 <w:sz w:val="24"/>
                 <w:szCs w:val="24"/>
               </w:rPr>
-              <w:t xml:space="preserve">Dinda Siti </w:t>
-            </w:r>
-            <w:proofErr w:type="spellStart"/>
-            <w:r>
-              <w:rPr>
-                <w:rFonts w:ascii="Times New Roman" w:hAnsi="Times New Roman" w:cs="Times New Roman"/>
-                <w:color w:val="000000"/>
-                <w:sz w:val="24"/>
-                <w:szCs w:val="24"/>
-              </w:rPr>
-              <w:t>Jenab</w:t>
-            </w:r>
-            <w:proofErr w:type="spellEnd"/>
+              <w:t>Dinda Siti Jenab</w:t>
+            </w:r>
           </w:p>
         </w:tc>
         <w:tc>
@@ -9699,7 +9202,6 @@
                 <w:szCs w:val="24"/>
               </w:rPr>
             </w:pPr>
-            <w:proofErr w:type="spellStart"/>
             <w:r>
               <w:rPr>
                 <w:rFonts w:ascii="Times New Roman" w:hAnsi="Times New Roman" w:cs="Times New Roman"/>
@@ -9707,17 +9209,7 @@
                 <w:sz w:val="24"/>
                 <w:szCs w:val="24"/>
               </w:rPr>
-              <w:t>Marshya</w:t>
-            </w:r>
-            <w:proofErr w:type="spellEnd"/>
-            <w:r>
-              <w:rPr>
-                <w:rFonts w:ascii="Times New Roman" w:hAnsi="Times New Roman" w:cs="Times New Roman"/>
-                <w:color w:val="000000"/>
-                <w:sz w:val="24"/>
-                <w:szCs w:val="24"/>
-              </w:rPr>
-              <w:t xml:space="preserve"> Miracle</w:t>
+              <w:t>Marshya Miracle</w:t>
             </w:r>
           </w:p>
         </w:tc>
@@ -10065,19 +9557,8 @@
                 <w:sz w:val="24"/>
                 <w:szCs w:val="24"/>
               </w:rPr>
-              <w:t xml:space="preserve">Danu Ardhi </w:t>
-            </w:r>
-            <w:proofErr w:type="spellStart"/>
-            <w:r>
-              <w:rPr>
-                <w:rFonts w:ascii="Times New Roman" w:hAnsi="Times New Roman" w:cs="Times New Roman"/>
-                <w:color w:val="000000"/>
-                <w:sz w:val="24"/>
-                <w:szCs w:val="24"/>
-              </w:rPr>
-              <w:t>Pradityo</w:t>
-            </w:r>
-            <w:proofErr w:type="spellEnd"/>
+              <w:t>Danu Ardhi Pradityo</w:t>
+            </w:r>
           </w:p>
         </w:tc>
         <w:tc>
@@ -10394,47 +9875,7 @@
                 <w:sz w:val="24"/>
                 <w:szCs w:val="24"/>
               </w:rPr>
-              <w:t xml:space="preserve">Zahra </w:t>
-            </w:r>
-            <w:proofErr w:type="spellStart"/>
-            <w:r>
-              <w:rPr>
-                <w:rFonts w:ascii="Times New Roman" w:hAnsi="Times New Roman" w:cs="Times New Roman"/>
-                <w:color w:val="000000"/>
-                <w:sz w:val="24"/>
-                <w:szCs w:val="24"/>
-              </w:rPr>
-              <w:t>Rofa</w:t>
-            </w:r>
-            <w:proofErr w:type="spellEnd"/>
-            <w:r>
-              <w:rPr>
-                <w:rFonts w:ascii="Times New Roman" w:hAnsi="Times New Roman" w:cs="Times New Roman"/>
-                <w:color w:val="000000"/>
-                <w:sz w:val="24"/>
-                <w:szCs w:val="24"/>
-              </w:rPr>
-              <w:t xml:space="preserve"> </w:t>
-            </w:r>
-            <w:proofErr w:type="spellStart"/>
-            <w:r>
-              <w:rPr>
-                <w:rFonts w:ascii="Times New Roman" w:hAnsi="Times New Roman" w:cs="Times New Roman"/>
-                <w:color w:val="000000"/>
-                <w:sz w:val="24"/>
-                <w:szCs w:val="24"/>
-              </w:rPr>
-              <w:t>Saefatumilah</w:t>
-            </w:r>
-            <w:proofErr w:type="spellEnd"/>
-            <w:r>
-              <w:rPr>
-                <w:rFonts w:ascii="Times New Roman" w:hAnsi="Times New Roman" w:cs="Times New Roman"/>
-                <w:color w:val="000000"/>
-                <w:sz w:val="24"/>
-                <w:szCs w:val="24"/>
-              </w:rPr>
-              <w:t xml:space="preserve"> </w:t>
+              <w:t xml:space="preserve">Zahra Rofa Saefatumilah </w:t>
             </w:r>
           </w:p>
         </w:tc>
@@ -10778,27 +10219,7 @@
                 <w:sz w:val="24"/>
                 <w:szCs w:val="24"/>
               </w:rPr>
-              <w:t xml:space="preserve">Nida </w:t>
-            </w:r>
-            <w:proofErr w:type="spellStart"/>
-            <w:r>
-              <w:rPr>
-                <w:rFonts w:ascii="Times New Roman" w:hAnsi="Times New Roman" w:cs="Times New Roman"/>
-                <w:color w:val="000000"/>
-                <w:sz w:val="24"/>
-                <w:szCs w:val="24"/>
-              </w:rPr>
-              <w:t>Khofiyya</w:t>
-            </w:r>
-            <w:proofErr w:type="spellEnd"/>
-            <w:r>
-              <w:rPr>
-                <w:rFonts w:ascii="Times New Roman" w:hAnsi="Times New Roman" w:cs="Times New Roman"/>
-                <w:color w:val="000000"/>
-                <w:sz w:val="24"/>
-                <w:szCs w:val="24"/>
-              </w:rPr>
-              <w:t xml:space="preserve"> Fauziah</w:t>
+              <w:t>Nida Khofiyya Fauziah</w:t>
             </w:r>
           </w:p>
         </w:tc>
@@ -10951,7 +10372,6 @@
                 <w:szCs w:val="24"/>
               </w:rPr>
             </w:pPr>
-            <w:proofErr w:type="spellStart"/>
             <w:r>
               <w:rPr>
                 <w:rFonts w:ascii="Times New Roman" w:hAnsi="Times New Roman" w:cs="Times New Roman"/>
@@ -10959,17 +10379,7 @@
                 <w:sz w:val="24"/>
                 <w:szCs w:val="24"/>
               </w:rPr>
-              <w:t>Kazzeta</w:t>
-            </w:r>
-            <w:proofErr w:type="spellEnd"/>
-            <w:r>
-              <w:rPr>
-                <w:rFonts w:ascii="Times New Roman" w:hAnsi="Times New Roman" w:cs="Times New Roman"/>
-                <w:color w:val="000000"/>
-                <w:sz w:val="24"/>
-                <w:szCs w:val="24"/>
-              </w:rPr>
-              <w:t xml:space="preserve"> Oktavia S</w:t>
+              <w:t>Kazzeta Oktavia S</w:t>
             </w:r>
           </w:p>
         </w:tc>
@@ -11121,7 +10531,6 @@
                 <w:szCs w:val="24"/>
               </w:rPr>
             </w:pPr>
-            <w:proofErr w:type="spellStart"/>
             <w:r>
               <w:rPr>
                 <w:rFonts w:ascii="Times New Roman" w:hAnsi="Times New Roman" w:cs="Times New Roman"/>
@@ -11129,17 +10538,7 @@
                 <w:sz w:val="24"/>
                 <w:szCs w:val="24"/>
               </w:rPr>
-              <w:t>Nea</w:t>
-            </w:r>
-            <w:proofErr w:type="spellEnd"/>
-            <w:r>
-              <w:rPr>
-                <w:rFonts w:ascii="Times New Roman" w:hAnsi="Times New Roman" w:cs="Times New Roman"/>
-                <w:color w:val="000000"/>
-                <w:sz w:val="24"/>
-                <w:szCs w:val="24"/>
-              </w:rPr>
-              <w:t xml:space="preserve"> Febriyanti</w:t>
+              <w:t>Nea Febriyanti</w:t>
             </w:r>
           </w:p>
         </w:tc>
@@ -11298,27 +10697,7 @@
                 <w:sz w:val="24"/>
                 <w:szCs w:val="24"/>
               </w:rPr>
-              <w:t xml:space="preserve">Kenzy </w:t>
-            </w:r>
-            <w:proofErr w:type="spellStart"/>
-            <w:r>
-              <w:rPr>
-                <w:rFonts w:ascii="Times New Roman" w:hAnsi="Times New Roman" w:cs="Times New Roman"/>
-                <w:color w:val="000000"/>
-                <w:sz w:val="24"/>
-                <w:szCs w:val="24"/>
-              </w:rPr>
-              <w:t>Rafaela</w:t>
-            </w:r>
-            <w:proofErr w:type="spellEnd"/>
-            <w:r>
-              <w:rPr>
-                <w:rFonts w:ascii="Times New Roman" w:hAnsi="Times New Roman" w:cs="Times New Roman"/>
-                <w:color w:val="000000"/>
-                <w:sz w:val="24"/>
-                <w:szCs w:val="24"/>
-              </w:rPr>
-              <w:t xml:space="preserve"> Alhasby Nasution</w:t>
+              <w:t>Kenzy Rafaela Alhasby Nasution</w:t>
             </w:r>
           </w:p>
         </w:tc>
@@ -11803,7 +11182,6 @@
                 <w:szCs w:val="24"/>
               </w:rPr>
             </w:pPr>
-            <w:proofErr w:type="spellStart"/>
             <w:r>
               <w:rPr>
                 <w:rFonts w:ascii="Times New Roman" w:hAnsi="Times New Roman" w:cs="Times New Roman"/>
@@ -11811,17 +11189,7 @@
                 <w:sz w:val="24"/>
                 <w:szCs w:val="24"/>
               </w:rPr>
-              <w:t>Kazetta</w:t>
-            </w:r>
-            <w:proofErr w:type="spellEnd"/>
-            <w:r>
-              <w:rPr>
-                <w:rFonts w:ascii="Times New Roman" w:hAnsi="Times New Roman" w:cs="Times New Roman"/>
-                <w:color w:val="000000"/>
-                <w:sz w:val="24"/>
-                <w:szCs w:val="24"/>
-              </w:rPr>
-              <w:t xml:space="preserve"> Oktavia</w:t>
+              <w:t>Kazetta Oktavia</w:t>
             </w:r>
           </w:p>
         </w:tc>
@@ -11996,7 +11364,6 @@
                 <w:szCs w:val="24"/>
               </w:rPr>
             </w:pPr>
-            <w:proofErr w:type="spellStart"/>
             <w:r>
               <w:rPr>
                 <w:rFonts w:ascii="Times New Roman" w:hAnsi="Times New Roman" w:cs="Times New Roman"/>
@@ -12004,17 +11371,7 @@
                 <w:sz w:val="24"/>
                 <w:szCs w:val="24"/>
               </w:rPr>
-              <w:t>Resaka</w:t>
-            </w:r>
-            <w:proofErr w:type="spellEnd"/>
-            <w:r>
-              <w:rPr>
-                <w:rFonts w:ascii="Times New Roman" w:hAnsi="Times New Roman" w:cs="Times New Roman"/>
-                <w:color w:val="000000"/>
-                <w:sz w:val="24"/>
-                <w:szCs w:val="24"/>
-              </w:rPr>
-              <w:t xml:space="preserve"> Auliani</w:t>
+              <w:t>Resaka Auliani</w:t>
             </w:r>
           </w:p>
         </w:tc>
@@ -12173,27 +11530,7 @@
                 <w:sz w:val="24"/>
                 <w:szCs w:val="24"/>
               </w:rPr>
-              <w:t xml:space="preserve">Aura </w:t>
-            </w:r>
-            <w:proofErr w:type="spellStart"/>
-            <w:r>
-              <w:rPr>
-                <w:rFonts w:ascii="Times New Roman" w:hAnsi="Times New Roman" w:cs="Times New Roman"/>
-                <w:color w:val="000000"/>
-                <w:sz w:val="24"/>
-                <w:szCs w:val="24"/>
-              </w:rPr>
-              <w:t>Anaya</w:t>
-            </w:r>
-            <w:proofErr w:type="spellEnd"/>
-            <w:r>
-              <w:rPr>
-                <w:rFonts w:ascii="Times New Roman" w:hAnsi="Times New Roman" w:cs="Times New Roman"/>
-                <w:color w:val="000000"/>
-                <w:sz w:val="24"/>
-                <w:szCs w:val="24"/>
-              </w:rPr>
-              <w:t xml:space="preserve"> Dewi</w:t>
+              <w:t>Aura Anaya Dewi</w:t>
             </w:r>
           </w:p>
         </w:tc>
@@ -13003,27 +12340,7 @@
                 <w:sz w:val="24"/>
                 <w:szCs w:val="24"/>
               </w:rPr>
-              <w:t xml:space="preserve">Salsa Bila Nur </w:t>
-            </w:r>
-            <w:proofErr w:type="spellStart"/>
-            <w:r>
-              <w:rPr>
-                <w:rFonts w:ascii="Times New Roman" w:hAnsi="Times New Roman" w:cs="Times New Roman"/>
-                <w:color w:val="000000"/>
-                <w:sz w:val="24"/>
-                <w:szCs w:val="24"/>
-              </w:rPr>
-              <w:t>Alipah</w:t>
-            </w:r>
-            <w:proofErr w:type="spellEnd"/>
-            <w:r>
-              <w:rPr>
-                <w:rFonts w:ascii="Times New Roman" w:hAnsi="Times New Roman" w:cs="Times New Roman"/>
-                <w:color w:val="000000"/>
-                <w:sz w:val="24"/>
-                <w:szCs w:val="24"/>
-              </w:rPr>
-              <w:t xml:space="preserve"> </w:t>
+              <w:t xml:space="preserve">Salsa Bila Nur Alipah </w:t>
             </w:r>
           </w:p>
         </w:tc>
@@ -13358,7 +12675,6 @@
                 <w:szCs w:val="24"/>
               </w:rPr>
             </w:pPr>
-            <w:proofErr w:type="spellStart"/>
             <w:r>
               <w:rPr>
                 <w:rFonts w:ascii="Times New Roman" w:hAnsi="Times New Roman" w:cs="Times New Roman"/>
@@ -13366,37 +12682,7 @@
                 <w:sz w:val="24"/>
                 <w:szCs w:val="24"/>
               </w:rPr>
-              <w:t>Nazhan</w:t>
-            </w:r>
-            <w:proofErr w:type="spellEnd"/>
-            <w:r>
-              <w:rPr>
-                <w:rFonts w:ascii="Times New Roman" w:hAnsi="Times New Roman" w:cs="Times New Roman"/>
-                <w:color w:val="000000"/>
-                <w:sz w:val="24"/>
-                <w:szCs w:val="24"/>
-              </w:rPr>
-              <w:t xml:space="preserve"> </w:t>
-            </w:r>
-            <w:proofErr w:type="spellStart"/>
-            <w:r>
-              <w:rPr>
-                <w:rFonts w:ascii="Times New Roman" w:hAnsi="Times New Roman" w:cs="Times New Roman"/>
-                <w:color w:val="000000"/>
-                <w:sz w:val="24"/>
-                <w:szCs w:val="24"/>
-              </w:rPr>
-              <w:t>Nasulloh</w:t>
-            </w:r>
-            <w:proofErr w:type="spellEnd"/>
-            <w:r>
-              <w:rPr>
-                <w:rFonts w:ascii="Times New Roman" w:hAnsi="Times New Roman" w:cs="Times New Roman"/>
-                <w:color w:val="000000"/>
-                <w:sz w:val="24"/>
-                <w:szCs w:val="24"/>
-              </w:rPr>
-              <w:t xml:space="preserve"> </w:t>
+              <w:t xml:space="preserve">Nazhan Nasulloh </w:t>
             </w:r>
           </w:p>
         </w:tc>
@@ -13555,27 +12841,7 @@
                 <w:sz w:val="24"/>
                 <w:szCs w:val="24"/>
               </w:rPr>
-              <w:t xml:space="preserve">Muhammad </w:t>
-            </w:r>
-            <w:proofErr w:type="spellStart"/>
-            <w:r>
-              <w:rPr>
-                <w:rFonts w:ascii="Times New Roman" w:hAnsi="Times New Roman" w:cs="Times New Roman"/>
-                <w:color w:val="000000"/>
-                <w:sz w:val="24"/>
-                <w:szCs w:val="24"/>
-              </w:rPr>
-              <w:t>Nevan</w:t>
-            </w:r>
-            <w:proofErr w:type="spellEnd"/>
-            <w:r>
-              <w:rPr>
-                <w:rFonts w:ascii="Times New Roman" w:hAnsi="Times New Roman" w:cs="Times New Roman"/>
-                <w:color w:val="000000"/>
-                <w:sz w:val="24"/>
-                <w:szCs w:val="24"/>
-              </w:rPr>
-              <w:t xml:space="preserve"> Alfath</w:t>
+              <w:t>Muhammad Nevan Alfath</w:t>
             </w:r>
           </w:p>
         </w:tc>
@@ -13933,27 +13199,7 @@
                 <w:sz w:val="24"/>
                 <w:szCs w:val="24"/>
               </w:rPr>
-              <w:t xml:space="preserve">Wafa </w:t>
-            </w:r>
-            <w:proofErr w:type="spellStart"/>
-            <w:r>
-              <w:rPr>
-                <w:rFonts w:ascii="Times New Roman" w:hAnsi="Times New Roman" w:cs="Times New Roman"/>
-                <w:color w:val="000000"/>
-                <w:sz w:val="24"/>
-                <w:szCs w:val="24"/>
-              </w:rPr>
-              <w:t>Awwaliatunnisa</w:t>
-            </w:r>
-            <w:proofErr w:type="spellEnd"/>
-            <w:r>
-              <w:rPr>
-                <w:rFonts w:ascii="Times New Roman" w:hAnsi="Times New Roman" w:cs="Times New Roman"/>
-                <w:color w:val="000000"/>
-                <w:sz w:val="24"/>
-                <w:szCs w:val="24"/>
-              </w:rPr>
-              <w:t xml:space="preserve"> R</w:t>
+              <w:t>Wafa Awwaliatunnisa R</w:t>
             </w:r>
           </w:p>
         </w:tc>
@@ -14105,7 +13351,6 @@
                 <w:szCs w:val="24"/>
               </w:rPr>
             </w:pPr>
-            <w:proofErr w:type="spellStart"/>
             <w:r>
               <w:rPr>
                 <w:rFonts w:ascii="Times New Roman" w:hAnsi="Times New Roman" w:cs="Times New Roman"/>
@@ -14113,17 +13358,7 @@
                 <w:sz w:val="24"/>
                 <w:szCs w:val="24"/>
               </w:rPr>
-              <w:t>Ferihana</w:t>
-            </w:r>
-            <w:proofErr w:type="spellEnd"/>
-            <w:r>
-              <w:rPr>
-                <w:rFonts w:ascii="Times New Roman" w:hAnsi="Times New Roman" w:cs="Times New Roman"/>
-                <w:color w:val="000000"/>
-                <w:sz w:val="24"/>
-                <w:szCs w:val="24"/>
-              </w:rPr>
-              <w:t xml:space="preserve"> Mardina </w:t>
+              <w:t xml:space="preserve">Ferihana Mardina </w:t>
             </w:r>
           </w:p>
         </w:tc>
@@ -14441,19 +13676,8 @@
                 <w:sz w:val="24"/>
                 <w:szCs w:val="24"/>
               </w:rPr>
-              <w:t xml:space="preserve">Deby </w:t>
-            </w:r>
-            <w:proofErr w:type="spellStart"/>
-            <w:r>
-              <w:rPr>
-                <w:rFonts w:ascii="Times New Roman" w:hAnsi="Times New Roman" w:cs="Times New Roman"/>
-                <w:color w:val="000000"/>
-                <w:sz w:val="24"/>
-                <w:szCs w:val="24"/>
-              </w:rPr>
-              <w:t>Alinsky</w:t>
-            </w:r>
-            <w:proofErr w:type="spellEnd"/>
+              <w:t>Deby Alinsky</w:t>
+            </w:r>
           </w:p>
         </w:tc>
         <w:tc>
@@ -14770,39 +13994,8 @@
                 <w:sz w:val="24"/>
                 <w:szCs w:val="24"/>
               </w:rPr>
-              <w:t xml:space="preserve">Rury </w:t>
-            </w:r>
-            <w:proofErr w:type="spellStart"/>
-            <w:r>
-              <w:rPr>
-                <w:rFonts w:ascii="Times New Roman" w:hAnsi="Times New Roman" w:cs="Times New Roman"/>
-                <w:color w:val="000000"/>
-                <w:sz w:val="24"/>
-                <w:szCs w:val="24"/>
-              </w:rPr>
-              <w:t>January</w:t>
-            </w:r>
-            <w:proofErr w:type="spellEnd"/>
-            <w:r>
-              <w:rPr>
-                <w:rFonts w:ascii="Times New Roman" w:hAnsi="Times New Roman" w:cs="Times New Roman"/>
-                <w:color w:val="000000"/>
-                <w:sz w:val="24"/>
-                <w:szCs w:val="24"/>
-              </w:rPr>
-              <w:t xml:space="preserve"> </w:t>
-            </w:r>
-            <w:proofErr w:type="spellStart"/>
-            <w:r>
-              <w:rPr>
-                <w:rFonts w:ascii="Times New Roman" w:hAnsi="Times New Roman" w:cs="Times New Roman"/>
-                <w:color w:val="000000"/>
-                <w:sz w:val="24"/>
-                <w:szCs w:val="24"/>
-              </w:rPr>
-              <w:t>Risnawan</w:t>
-            </w:r>
-            <w:proofErr w:type="spellEnd"/>
+              <w:t>Rury January Risnawan</w:t>
+            </w:r>
           </w:p>
         </w:tc>
         <w:tc>
@@ -15112,7 +14305,6 @@
                 <w:szCs w:val="24"/>
               </w:rPr>
             </w:pPr>
-            <w:proofErr w:type="spellStart"/>
             <w:r>
               <w:rPr>
                 <w:rFonts w:ascii="Times New Roman" w:hAnsi="Times New Roman" w:cs="Times New Roman"/>
@@ -15120,17 +14312,7 @@
                 <w:sz w:val="24"/>
                 <w:szCs w:val="24"/>
               </w:rPr>
-              <w:t>R.Muhammad</w:t>
-            </w:r>
-            <w:proofErr w:type="spellEnd"/>
-            <w:r>
-              <w:rPr>
-                <w:rFonts w:ascii="Times New Roman" w:hAnsi="Times New Roman" w:cs="Times New Roman"/>
-                <w:color w:val="000000"/>
-                <w:sz w:val="24"/>
-                <w:szCs w:val="24"/>
-              </w:rPr>
-              <w:t xml:space="preserve"> Fajar Aqil Sugianto</w:t>
+              <w:t>R.Muhammad Fajar Aqil Sugianto</w:t>
             </w:r>
           </w:p>
         </w:tc>
@@ -15624,27 +14806,7 @@
                 <w:sz w:val="24"/>
                 <w:szCs w:val="24"/>
               </w:rPr>
-              <w:t xml:space="preserve">Muhamad </w:t>
-            </w:r>
-            <w:proofErr w:type="spellStart"/>
-            <w:r>
-              <w:rPr>
-                <w:rFonts w:ascii="Times New Roman" w:hAnsi="Times New Roman" w:cs="Times New Roman"/>
-                <w:color w:val="000000"/>
-                <w:sz w:val="24"/>
-                <w:szCs w:val="24"/>
-              </w:rPr>
-              <w:t>Meiky</w:t>
-            </w:r>
-            <w:proofErr w:type="spellEnd"/>
-            <w:r>
-              <w:rPr>
-                <w:rFonts w:ascii="Times New Roman" w:hAnsi="Times New Roman" w:cs="Times New Roman"/>
-                <w:color w:val="000000"/>
-                <w:sz w:val="24"/>
-                <w:szCs w:val="24"/>
-              </w:rPr>
-              <w:t xml:space="preserve"> Ramdani </w:t>
+              <w:t xml:space="preserve">Muhamad Meiky Ramdani </w:t>
             </w:r>
           </w:p>
         </w:tc>
@@ -16319,30 +15481,6 @@
         </w:tc>
       </w:tr>
     </w:tbl>
-    <w:p>
-      <w:pPr>
-        <w:widowControl w:val="0"/>
-        <w:spacing w:before="189" w:after="0" w:line="240" w:lineRule="auto"/>
-        <w:rPr>
-          <w:rFonts w:ascii="Times New Roman" w:eastAsia="Times New Roman" w:hAnsi="Times New Roman" w:cs="Times New Roman"/>
-          <w:b/>
-          <w:sz w:val="24"/>
-          <w:szCs w:val="24"/>
-        </w:rPr>
-      </w:pPr>
-    </w:p>
-    <w:p>
-      <w:pPr>
-        <w:widowControl w:val="0"/>
-        <w:spacing w:before="189" w:after="0" w:line="240" w:lineRule="auto"/>
-        <w:rPr>
-          <w:rFonts w:ascii="Times New Roman" w:eastAsia="Times New Roman" w:hAnsi="Times New Roman" w:cs="Times New Roman"/>
-          <w:b/>
-          <w:sz w:val="24"/>
-          <w:szCs w:val="24"/>
-        </w:rPr>
-      </w:pPr>
-    </w:p>
     <w:p>
       <w:pPr>
         <w:widowControl w:val="0"/>
@@ -16493,7 +15631,7 @@
                 <w:sz w:val="24"/>
                 <w:szCs w:val="24"/>
               </w:rPr>
-              <w:t xml:space="preserve">25 Agustus </w:t>
+              <w:t xml:space="preserve">Agustus </w:t>
             </w:r>
             <w:r>
               <w:rPr>
@@ -16586,7 +15724,6 @@
                 <w:szCs w:val="24"/>
               </w:rPr>
             </w:pPr>
-            <w:proofErr w:type="spellStart"/>
             <w:r>
               <w:rPr>
                 <w:rFonts w:ascii="Times New Roman" w:eastAsia="Times New Roman" w:hAnsi="Times New Roman" w:cs="Times New Roman"/>
@@ -16594,17 +15731,7 @@
                 <w:sz w:val="24"/>
                 <w:szCs w:val="24"/>
               </w:rPr>
-              <w:t>Wakasek</w:t>
-            </w:r>
-            <w:proofErr w:type="spellEnd"/>
-            <w:r>
-              <w:rPr>
-                <w:rFonts w:ascii="Times New Roman" w:eastAsia="Times New Roman" w:hAnsi="Times New Roman" w:cs="Times New Roman"/>
-                <w:b/>
-                <w:sz w:val="24"/>
-                <w:szCs w:val="24"/>
-              </w:rPr>
-              <w:t xml:space="preserve"> Bidang Kesiswaan</w:t>
+              <w:t>Wakasek Bidang Kesiswaan</w:t>
             </w:r>
           </w:p>
         </w:tc>
@@ -16634,6 +15761,66 @@
                 <w:szCs w:val="24"/>
               </w:rPr>
             </w:pPr>
+            <w:r>
+              <w:rPr>
+                <w:rFonts w:ascii="Times New Roman" w:eastAsia="Times New Roman" w:hAnsi="Times New Roman" w:cs="Times New Roman"/>
+                <w:b/>
+                <w:noProof/>
+                <w:sz w:val="24"/>
+                <w:szCs w:val="24"/>
+              </w:rPr>
+              <w:drawing>
+                <wp:inline distT="0" distB="0" distL="0" distR="0" wp14:anchorId="205E1DCD" wp14:editId="192ECD25">
+                  <wp:extent cx="2407920" cy="1224915"/>
+                  <wp:effectExtent l="0" t="0" r="0" b="0"/>
+                  <wp:docPr id="297248001" name="Picture 1" descr="A signature on a black background&#10;&#10;AI-generated content may be incorrect."/>
+                  <wp:cNvGraphicFramePr>
+                    <a:graphicFrameLocks xmlns:a="http://schemas.openxmlformats.org/drawingml/2006/main" noChangeAspect="1"/>
+                  </wp:cNvGraphicFramePr>
+                  <a:graphic xmlns:a="http://schemas.openxmlformats.org/drawingml/2006/main">
+                    <a:graphicData uri="http://schemas.openxmlformats.org/drawingml/2006/picture">
+                      <pic:pic xmlns:pic="http://schemas.openxmlformats.org/drawingml/2006/picture">
+                        <pic:nvPicPr>
+                          <pic:cNvPr id="297248001" name="Picture 1" descr="A signature on a black background&#10;&#10;AI-generated content may be incorrect."/>
+                          <pic:cNvPicPr/>
+                        </pic:nvPicPr>
+                        <pic:blipFill>
+                          <a:blip r:embed="rId9">
+                            <a:biLevel thresh="75000"/>
+                            <a:extLst>
+                              <a:ext uri="{BEBA8EAE-BF5A-486C-A8C5-ECC9F3942E4B}">
+                                <a14:imgProps xmlns:a14="http://schemas.microsoft.com/office/drawing/2010/main">
+                                  <a14:imgLayer r:embed="rId10">
+                                    <a14:imgEffect>
+                                      <a14:artisticCutout/>
+                                    </a14:imgEffect>
+                                  </a14:imgLayer>
+                                </a14:imgProps>
+                              </a:ext>
+                              <a:ext uri="{28A0092B-C50C-407E-A947-70E740481C1C}">
+                                <a14:useLocalDpi xmlns:a14="http://schemas.microsoft.com/office/drawing/2010/main" val="0"/>
+                              </a:ext>
+                            </a:extLst>
+                          </a:blip>
+                          <a:stretch>
+                            <a:fillRect/>
+                          </a:stretch>
+                        </pic:blipFill>
+                        <pic:spPr>
+                          <a:xfrm>
+                            <a:off x="0" y="0"/>
+                            <a:ext cx="2407920" cy="1224915"/>
+                          </a:xfrm>
+                          <a:prstGeom prst="rect">
+                            <a:avLst/>
+                          </a:prstGeom>
+                        </pic:spPr>
+                      </pic:pic>
+                    </a:graphicData>
+                  </a:graphic>
+                </wp:inline>
+              </w:drawing>
+            </w:r>
           </w:p>
         </w:tc>
         <w:tc>
@@ -16685,9 +15872,6 @@
         </w:tc>
       </w:tr>
       <w:tr>
-        <w:trPr>
-          <w:trHeight w:val="283"/>
-        </w:trPr>
         <w:tc>
           <w:tcPr>
             <w:tcW w:w="3992" w:type="dxa"/>
@@ -16700,15 +15884,45 @@
           </w:tcPr>
           <w:p>
             <w:pPr>
-              <w:widowControl w:val="0"/>
               <w:spacing w:after="0" w:line="240" w:lineRule="auto"/>
+              <w:jc w:val="center"/>
               <w:rPr>
                 <w:rFonts w:ascii="Times New Roman" w:eastAsia="Times New Roman" w:hAnsi="Times New Roman" w:cs="Times New Roman"/>
                 <w:b/>
                 <w:sz w:val="24"/>
                 <w:szCs w:val="24"/>
-              </w:rPr>
-            </w:pPr>
+                <w:u w:val="single"/>
+              </w:rPr>
+            </w:pPr>
+            <w:r>
+              <w:rPr>
+                <w:rFonts w:ascii="Times New Roman" w:eastAsia="Times New Roman" w:hAnsi="Times New Roman" w:cs="Times New Roman"/>
+                <w:b/>
+                <w:sz w:val="24"/>
+                <w:szCs w:val="24"/>
+                <w:u w:val="single"/>
+              </w:rPr>
+              <w:t>INDRA HENDRAWAN, S.Pd.</w:t>
+            </w:r>
+          </w:p>
+          <w:p>
+            <w:pPr>
+              <w:spacing w:line="240" w:lineRule="auto"/>
+              <w:jc w:val="center"/>
+              <w:rPr>
+                <w:rFonts w:ascii="Times New Roman" w:eastAsia="Times New Roman" w:hAnsi="Times New Roman" w:cs="Times New Roman"/>
+                <w:sz w:val="24"/>
+                <w:szCs w:val="24"/>
+              </w:rPr>
+            </w:pPr>
+            <w:r>
+              <w:rPr>
+                <w:rFonts w:ascii="Times New Roman" w:eastAsia="Times New Roman" w:hAnsi="Times New Roman" w:cs="Times New Roman"/>
+                <w:sz w:val="24"/>
+                <w:szCs w:val="24"/>
+              </w:rPr>
+              <w:t>NIP. 19820301 202321 1 004</w:t>
+            </w:r>
           </w:p>
         </w:tc>
         <w:tc>
@@ -16749,31 +15963,16 @@
             <w:pPr>
               <w:widowControl w:val="0"/>
               <w:spacing w:after="0" w:line="240" w:lineRule="auto"/>
+              <w:jc w:val="center"/>
               <w:rPr>
                 <w:rFonts w:ascii="Times New Roman" w:eastAsia="Times New Roman" w:hAnsi="Times New Roman" w:cs="Times New Roman"/>
                 <w:b/>
                 <w:sz w:val="24"/>
                 <w:szCs w:val="24"/>
-              </w:rPr>
-            </w:pPr>
-          </w:p>
-        </w:tc>
-      </w:tr>
-      <w:tr>
-        <w:tc>
-          <w:tcPr>
-            <w:tcW w:w="3992" w:type="dxa"/>
-            <w:tcMar>
-              <w:top w:w="100" w:type="dxa"/>
-              <w:left w:w="100" w:type="dxa"/>
-              <w:bottom w:w="100" w:type="dxa"/>
-              <w:right w:w="100" w:type="dxa"/>
-            </w:tcMar>
-          </w:tcPr>
-          <w:p>
-            <w:pPr>
-              <w:spacing w:after="0" w:line="240" w:lineRule="auto"/>
-              <w:jc w:val="center"/>
+                <w:u w:val="single"/>
+              </w:rPr>
+            </w:pPr>
+            <w:r>
               <w:rPr>
                 <w:rFonts w:ascii="Times New Roman" w:eastAsia="Times New Roman" w:hAnsi="Times New Roman" w:cs="Times New Roman"/>
                 <w:b/>
@@ -16781,107 +15980,8 @@
                 <w:szCs w:val="24"/>
                 <w:u w:val="single"/>
               </w:rPr>
-            </w:pPr>
-            <w:r>
-              <w:rPr>
-                <w:rFonts w:ascii="Times New Roman" w:eastAsia="Times New Roman" w:hAnsi="Times New Roman" w:cs="Times New Roman"/>
-                <w:b/>
-                <w:sz w:val="24"/>
-                <w:szCs w:val="24"/>
-                <w:u w:val="single"/>
-              </w:rPr>
-              <w:t>INDRA HENDRAWAN, S.Pd.</w:t>
-            </w:r>
-          </w:p>
-          <w:p>
-            <w:pPr>
-              <w:spacing w:line="240" w:lineRule="auto"/>
-              <w:jc w:val="center"/>
-              <w:rPr>
-                <w:rFonts w:ascii="Times New Roman" w:eastAsia="Times New Roman" w:hAnsi="Times New Roman" w:cs="Times New Roman"/>
-                <w:sz w:val="24"/>
-                <w:szCs w:val="24"/>
-              </w:rPr>
-            </w:pPr>
-            <w:r>
-              <w:rPr>
-                <w:rFonts w:ascii="Times New Roman" w:eastAsia="Times New Roman" w:hAnsi="Times New Roman" w:cs="Times New Roman"/>
-                <w:sz w:val="24"/>
-                <w:szCs w:val="24"/>
-              </w:rPr>
-              <w:t>NIP. 19820301 202321 1 004</w:t>
-            </w:r>
-          </w:p>
-        </w:tc>
-        <w:tc>
-          <w:tcPr>
-            <w:tcW w:w="1200" w:type="dxa"/>
-            <w:tcMar>
-              <w:top w:w="100" w:type="dxa"/>
-              <w:left w:w="100" w:type="dxa"/>
-              <w:bottom w:w="100" w:type="dxa"/>
-              <w:right w:w="100" w:type="dxa"/>
-            </w:tcMar>
-          </w:tcPr>
-          <w:p>
-            <w:pPr>
-              <w:widowControl w:val="0"/>
-              <w:spacing w:after="0" w:line="240" w:lineRule="auto"/>
-              <w:jc w:val="center"/>
-              <w:rPr>
-                <w:rFonts w:ascii="Times New Roman" w:eastAsia="Times New Roman" w:hAnsi="Times New Roman" w:cs="Times New Roman"/>
-                <w:b/>
-                <w:sz w:val="24"/>
-                <w:szCs w:val="24"/>
-              </w:rPr>
-            </w:pPr>
-          </w:p>
-        </w:tc>
-        <w:tc>
-          <w:tcPr>
-            <w:tcW w:w="3829" w:type="dxa"/>
-            <w:tcMar>
-              <w:top w:w="100" w:type="dxa"/>
-              <w:left w:w="100" w:type="dxa"/>
-              <w:bottom w:w="100" w:type="dxa"/>
-              <w:right w:w="100" w:type="dxa"/>
-            </w:tcMar>
-          </w:tcPr>
-          <w:p>
-            <w:pPr>
-              <w:widowControl w:val="0"/>
-              <w:spacing w:after="0" w:line="240" w:lineRule="auto"/>
-              <w:jc w:val="center"/>
-              <w:rPr>
-                <w:rFonts w:ascii="Times New Roman" w:eastAsia="Times New Roman" w:hAnsi="Times New Roman" w:cs="Times New Roman"/>
-                <w:b/>
-                <w:sz w:val="24"/>
-                <w:szCs w:val="24"/>
-                <w:u w:val="single"/>
-              </w:rPr>
-            </w:pPr>
-            <w:r>
-              <w:rPr>
-                <w:rFonts w:ascii="Times New Roman" w:eastAsia="Times New Roman" w:hAnsi="Times New Roman" w:cs="Times New Roman"/>
-                <w:b/>
-                <w:sz w:val="24"/>
-                <w:szCs w:val="24"/>
-                <w:u w:val="single"/>
-              </w:rPr>
-              <w:t xml:space="preserve">NINING IRMA AHDIANTI, </w:t>
-            </w:r>
-            <w:proofErr w:type="spellStart"/>
-            <w:r>
-              <w:rPr>
-                <w:rFonts w:ascii="Times New Roman" w:eastAsia="Times New Roman" w:hAnsi="Times New Roman" w:cs="Times New Roman"/>
-                <w:b/>
-                <w:sz w:val="24"/>
-                <w:szCs w:val="24"/>
-                <w:u w:val="single"/>
-              </w:rPr>
-              <w:t>S.Pd</w:t>
-            </w:r>
-            <w:proofErr w:type="spellEnd"/>
+              <w:t>NINING IRMA AHDIANTI, S.Pd</w:t>
+            </w:r>
           </w:p>
           <w:p>
             <w:pPr>
@@ -17150,6 +16250,28 @@
               </w:rPr>
             </w:pPr>
           </w:p>
+          <w:p>
+            <w:pPr>
+              <w:widowControl w:val="0"/>
+              <w:spacing w:before="189"/>
+              <w:rPr>
+                <w:rFonts w:ascii="Times New Roman" w:eastAsia="Times New Roman" w:hAnsi="Times New Roman" w:cs="Times New Roman"/>
+                <w:sz w:val="24"/>
+                <w:szCs w:val="24"/>
+              </w:rPr>
+            </w:pPr>
+          </w:p>
+          <w:p>
+            <w:pPr>
+              <w:widowControl w:val="0"/>
+              <w:spacing w:before="189"/>
+              <w:rPr>
+                <w:rFonts w:ascii="Times New Roman" w:eastAsia="Times New Roman" w:hAnsi="Times New Roman" w:cs="Times New Roman"/>
+                <w:sz w:val="24"/>
+                <w:szCs w:val="24"/>
+              </w:rPr>
+            </w:pPr>
+          </w:p>
         </w:tc>
         <w:tc>
           <w:tcPr>
@@ -17302,20 +16424,8 @@
                 <w:szCs w:val="24"/>
                 <w:u w:val="single"/>
               </w:rPr>
-              <w:t xml:space="preserve">JAKARIA, S.Pd., </w:t>
-            </w:r>
-            <w:proofErr w:type="spellStart"/>
-            <w:r>
-              <w:rPr>
-                <w:rFonts w:ascii="Times New Roman" w:eastAsia="Times New Roman" w:hAnsi="Times New Roman" w:cs="Times New Roman"/>
-                <w:b/>
-                <w:sz w:val="24"/>
-                <w:szCs w:val="24"/>
-                <w:u w:val="single"/>
-              </w:rPr>
-              <w:t>M.Pd</w:t>
-            </w:r>
-            <w:proofErr w:type="spellEnd"/>
+              <w:t>JAKARIA, S.Pd., M.Pd</w:t>
+            </w:r>
           </w:p>
           <w:p>
             <w:pPr>
@@ -17492,7 +16602,7 @@
                     <pic:cNvPicPr preferRelativeResize="0"/>
                   </pic:nvPicPr>
                   <pic:blipFill>
-                    <a:blip r:embed="rId9"/>
+                    <a:blip r:embed="rId11"/>
                     <a:srcRect/>
                     <a:stretch>
                       <a:fillRect/>
@@ -17574,7 +16684,7 @@
                     <pic:cNvPicPr preferRelativeResize="0"/>
                   </pic:nvPicPr>
                   <pic:blipFill>
-                    <a:blip r:embed="rId10"/>
+                    <a:blip r:embed="rId12"/>
                     <a:srcRect/>
                     <a:stretch>
                       <a:fillRect/>
@@ -17642,7 +16752,7 @@
                     <pic:cNvPicPr preferRelativeResize="0"/>
                   </pic:nvPicPr>
                   <pic:blipFill>
-                    <a:blip r:embed="rId11"/>
+                    <a:blip r:embed="rId13"/>
                     <a:srcRect/>
                     <a:stretch>
                       <a:fillRect/>
@@ -17699,7 +16809,7 @@
                     <pic:cNvPicPr preferRelativeResize="0"/>
                   </pic:nvPicPr>
                   <pic:blipFill>
-                    <a:blip r:embed="rId12"/>
+                    <a:blip r:embed="rId14"/>
                     <a:srcRect/>
                     <a:stretch>
                       <a:fillRect/>
@@ -17767,7 +16877,7 @@
                     <pic:cNvPicPr preferRelativeResize="0"/>
                   </pic:nvPicPr>
                   <pic:blipFill>
-                    <a:blip r:embed="rId13"/>
+                    <a:blip r:embed="rId15"/>
                     <a:srcRect/>
                     <a:stretch>
                       <a:fillRect/>
@@ -17905,7 +17015,7 @@
                     <pic:cNvPicPr preferRelativeResize="0"/>
                   </pic:nvPicPr>
                   <pic:blipFill>
-                    <a:blip r:embed="rId14"/>
+                    <a:blip r:embed="rId16"/>
                     <a:srcRect/>
                     <a:stretch>
                       <a:fillRect/>
@@ -17959,7 +17069,7 @@
                     <pic:cNvPicPr preferRelativeResize="0"/>
                   </pic:nvPicPr>
                   <pic:blipFill>
-                    <a:blip r:embed="rId15"/>
+                    <a:blip r:embed="rId17"/>
                     <a:srcRect/>
                     <a:stretch>
                       <a:fillRect/>
@@ -18507,47 +17617,7 @@
         <w:sz w:val="24"/>
         <w:szCs w:val="24"/>
       </w:rPr>
-      <w:t xml:space="preserve">Jl. Pasir Santa </w:t>
-    </w:r>
-    <w:proofErr w:type="spellStart"/>
-    <w:r>
-      <w:rPr>
-        <w:rFonts w:ascii="Times New Roman" w:eastAsia="Times New Roman" w:hAnsi="Times New Roman" w:cs="Times New Roman"/>
-        <w:color w:val="000000"/>
-        <w:sz w:val="24"/>
-        <w:szCs w:val="24"/>
-      </w:rPr>
-      <w:t>Telp</w:t>
-    </w:r>
-    <w:proofErr w:type="spellEnd"/>
-    <w:r>
-      <w:rPr>
-        <w:rFonts w:ascii="Times New Roman" w:eastAsia="Times New Roman" w:hAnsi="Times New Roman" w:cs="Times New Roman"/>
-        <w:color w:val="000000"/>
-        <w:sz w:val="24"/>
-        <w:szCs w:val="24"/>
-      </w:rPr>
-      <w:t xml:space="preserve">. (0263) 2934278 </w:t>
-    </w:r>
-    <w:proofErr w:type="spellStart"/>
-    <w:r>
-      <w:rPr>
-        <w:rFonts w:ascii="Times New Roman" w:eastAsia="Times New Roman" w:hAnsi="Times New Roman" w:cs="Times New Roman"/>
-        <w:color w:val="000000"/>
-        <w:sz w:val="24"/>
-        <w:szCs w:val="24"/>
-      </w:rPr>
-      <w:t>Ciranjang</w:t>
-    </w:r>
-    <w:proofErr w:type="spellEnd"/>
-    <w:r>
-      <w:rPr>
-        <w:rFonts w:ascii="Times New Roman" w:eastAsia="Times New Roman" w:hAnsi="Times New Roman" w:cs="Times New Roman"/>
-        <w:color w:val="000000"/>
-        <w:sz w:val="24"/>
-        <w:szCs w:val="24"/>
-      </w:rPr>
-      <w:t xml:space="preserve"> 43282</w:t>
+      <w:t>Jl. Pasir Santa Telp. (0263) 2934278 Ciranjang 43282</w:t>
     </w:r>
   </w:p>
 </w:hdr>

</xml_diff>